<commit_message>
from GVA to energy weights
</commit_message>
<xml_diff>
--- a/figurkatalog.docx
+++ b/figurkatalog.docx
@@ -7,7 +7,15 @@
         <w:jc w:val="both"/>
       </w:pPr>
       <w:r>
-        <w:t xml:space="preserve">Se først andelene af endeligt forbrug af energi, som kommer fra el. Dette kalder EUROSTAT for ”Rate of electrification”. </w:t>
+        <w:t xml:space="preserve">Se først andelene af endeligt forbrug af energi, som kommer fra el. Dette kalder EUROSTAT for ”Rate of </w:t>
+      </w:r>
+      <w:proofErr w:type="spellStart"/>
+      <w:r>
+        <w:t>electrification</w:t>
+      </w:r>
+      <w:proofErr w:type="spellEnd"/>
+      <w:r>
+        <w:t xml:space="preserve">”. </w:t>
       </w:r>
       <w:r>
         <w:t xml:space="preserve">Herunder vist over den tilgængelige tidshorisont for et udvalg af lande. </w:t>
@@ -119,7 +127,19 @@
         <w:jc w:val="both"/>
       </w:pPr>
       <w:r>
-        <w:br w:type="page"/>
+        <w:t xml:space="preserve">Sektorerne kan dekomponeres yderligere ned i 20 </w:t>
+      </w:r>
+      <w:r>
+        <w:t>underkategorier</w:t>
+      </w:r>
+      <w:r>
+        <w:t xml:space="preserve">. </w:t>
+      </w:r>
+      <w:r>
+        <w:t>På næste side vises Danmarks elektrificeringsrate mod EU-gennemsnittet på tværs af alle 20 underkategorier.</w:t>
+      </w:r>
+      <w:r>
+        <w:t xml:space="preserve"> </w:t>
       </w:r>
     </w:p>
     <w:p>
@@ -128,22 +148,11 @@
       </w:pPr>
       <w:r>
         <w:lastRenderedPageBreak/>
-        <w:t xml:space="preserve">Her er de to figurer gentaget, men startåret er indekseret til 100 </w:t>
-      </w:r>
-      <w:r>
-        <w:t>for begge detaljeringsgrader.</w:t>
-      </w:r>
-    </w:p>
-    <w:p>
-      <w:pPr>
-        <w:jc w:val="both"/>
-      </w:pPr>
-      <w:r>
         <w:drawing>
-          <wp:inline distT="0" distB="0" distL="0" distR="0" wp14:anchorId="72EC0443" wp14:editId="2E9D3496">
-            <wp:extent cx="6120130" cy="2016125"/>
-            <wp:effectExtent l="0" t="0" r="0" b="3175"/>
-            <wp:docPr id="992560189" name="Picture 1"/>
+          <wp:inline distT="0" distB="0" distL="0" distR="0" wp14:anchorId="675662D9" wp14:editId="783A09DE">
+            <wp:extent cx="6120130" cy="8163560"/>
+            <wp:effectExtent l="0" t="0" r="0" b="8890"/>
+            <wp:docPr id="883648489" name="Picture 1"/>
             <wp:cNvGraphicFramePr>
               <a:graphicFrameLocks xmlns:a="http://schemas.openxmlformats.org/drawingml/2006/main" noChangeAspect="1"/>
             </wp:cNvGraphicFramePr>
@@ -151,7 +160,7 @@
               <a:graphicData uri="http://schemas.openxmlformats.org/drawingml/2006/picture">
                 <pic:pic xmlns:pic="http://schemas.openxmlformats.org/drawingml/2006/picture">
                   <pic:nvPicPr>
-                    <pic:cNvPr id="992560189" name=""/>
+                    <pic:cNvPr id="883648489" name=""/>
                     <pic:cNvPicPr/>
                   </pic:nvPicPr>
                   <pic:blipFill>
@@ -163,7 +172,7 @@
                   <pic:spPr>
                     <a:xfrm>
                       <a:off x="0" y="0"/>
-                      <a:ext cx="6120130" cy="2016125"/>
+                      <a:ext cx="6120130" cy="8163560"/>
                     </a:xfrm>
                     <a:prstGeom prst="rect">
                       <a:avLst/>
@@ -176,11 +185,18 @@
         </w:drawing>
       </w:r>
       <w:r>
+        <w:rPr>
+          <w:noProof/>
+        </w:rPr>
+        <w:t xml:space="preserve"> </w:t>
+      </w:r>
+      <w:r>
+        <w:lastRenderedPageBreak/>
         <w:drawing>
-          <wp:inline distT="0" distB="0" distL="0" distR="0" wp14:anchorId="24420603" wp14:editId="0FE40FCD">
-            <wp:extent cx="6120130" cy="4158615"/>
-            <wp:effectExtent l="0" t="0" r="0" b="0"/>
-            <wp:docPr id="1781685293" name="Picture 1"/>
+          <wp:inline distT="0" distB="0" distL="0" distR="0" wp14:anchorId="522E0EEA" wp14:editId="54A4600C">
+            <wp:extent cx="6120130" cy="8208010"/>
+            <wp:effectExtent l="0" t="0" r="0" b="2540"/>
+            <wp:docPr id="1941220638" name="Picture 1"/>
             <wp:cNvGraphicFramePr>
               <a:graphicFrameLocks xmlns:a="http://schemas.openxmlformats.org/drawingml/2006/main" noChangeAspect="1"/>
             </wp:cNvGraphicFramePr>
@@ -188,7 +204,7 @@
               <a:graphicData uri="http://schemas.openxmlformats.org/drawingml/2006/picture">
                 <pic:pic xmlns:pic="http://schemas.openxmlformats.org/drawingml/2006/picture">
                   <pic:nvPicPr>
-                    <pic:cNvPr id="1781685293" name=""/>
+                    <pic:cNvPr id="1941220638" name=""/>
                     <pic:cNvPicPr/>
                   </pic:nvPicPr>
                   <pic:blipFill>
@@ -200,7 +216,7 @@
                   <pic:spPr>
                     <a:xfrm>
                       <a:off x="0" y="0"/>
-                      <a:ext cx="6120130" cy="4158615"/>
+                      <a:ext cx="6120130" cy="8208010"/>
                     </a:xfrm>
                     <a:prstGeom prst="rect">
                       <a:avLst/>
@@ -218,308 +234,27 @@
         <w:jc w:val="both"/>
       </w:pPr>
       <w:r>
-        <w:t xml:space="preserve">Sektorerne kan dekomponeres yderligere ned i 20 </w:t>
-      </w:r>
-      <w:r>
-        <w:t>underkategorier</w:t>
-      </w:r>
-      <w:r>
-        <w:t xml:space="preserve">. </w:t>
-      </w:r>
-      <w:r>
-        <w:t>På næste side vises Danmarks elektrificeringsrate mod EU-gennemsnittet på tværs af alle 20 underkategorier.</w:t>
-      </w:r>
-      <w:r>
-        <w:t xml:space="preserve"> </w:t>
+        <w:lastRenderedPageBreak/>
+        <w:t xml:space="preserve">Sidst er selve </w:t>
+      </w:r>
+      <w:proofErr w:type="spellStart"/>
+      <w:r>
+        <w:t>dekomponeringsøvelsen</w:t>
+      </w:r>
+      <w:proofErr w:type="spellEnd"/>
+      <w:r>
+        <w:t xml:space="preserve">, der søger at svare på, hvor meget af udviklingen over tid i elektrificeringsraten, som kommer fra hhv. skift i industrisammensætningen </w:t>
+      </w:r>
+      <w:r>
+        <w:t xml:space="preserve">og skift i elintensiteten indenfor industrier. </w:t>
       </w:r>
     </w:p>
     <w:p>
       <w:pPr>
         <w:jc w:val="both"/>
-      </w:pPr>
-      <w:r>
-        <w:t xml:space="preserve">Efterfølgende viser </w:t>
-      </w:r>
-      <w:r>
-        <w:t xml:space="preserve">jeg </w:t>
-      </w:r>
-      <w:r>
-        <w:t xml:space="preserve">bruttoværditilvæksten </w:t>
-      </w:r>
-      <w:r>
-        <w:t>(BVT</w:t>
-      </w:r>
-      <w:r>
-        <w:t>)</w:t>
-      </w:r>
-      <w:r>
-        <w:t xml:space="preserve"> </w:t>
-      </w:r>
-      <w:r>
-        <w:t>på tværs af de udvalgte lande</w:t>
-      </w:r>
-      <w:r>
-        <w:t xml:space="preserve"> over tid </w:t>
-      </w:r>
-      <w:r>
-        <w:t xml:space="preserve">på de samme 20 underkategorier. Dette gør jeg som </w:t>
-      </w:r>
-      <w:r>
-        <w:t xml:space="preserve">et sundhedstjek </w:t>
-      </w:r>
-      <w:r>
-        <w:t>af</w:t>
-      </w:r>
-      <w:r>
-        <w:t xml:space="preserve"> BVT-dataene, der bruges i shift-share dekomponeringen senere.</w:t>
-      </w:r>
-      <w:r>
-        <w:t xml:space="preserve"> Jeg har anvendt et ”grouping-map” for at gå fra 69-gr</w:t>
-      </w:r>
-      <w:r>
-        <w:t>u</w:t>
-      </w:r>
-      <w:r>
-        <w:t xml:space="preserve">peringen af industrier i industristatistikken til de 20 grupper af industrier i </w:t>
-      </w:r>
-      <w:r>
-        <w:t>elektrificeringsdataen</w:t>
-      </w:r>
-      <w:r>
-        <w:t>e</w:t>
-      </w:r>
-      <w:r>
-        <w:t>.</w:t>
-      </w:r>
-      <w:r>
-        <w:t xml:space="preserve"> Dette er den stærkeste antagelse i arbejdet.</w:t>
-      </w:r>
-    </w:p>
-    <w:p>
-      <w:pPr>
-        <w:jc w:val="both"/>
-      </w:pPr>
-      <w:r>
-        <w:lastRenderedPageBreak/>
-        <w:drawing>
-          <wp:inline distT="0" distB="0" distL="0" distR="0" wp14:anchorId="06F990EB" wp14:editId="0F1EEF93">
-            <wp:extent cx="6120130" cy="7987665"/>
-            <wp:effectExtent l="0" t="0" r="0" b="0"/>
-            <wp:docPr id="1618677838" name="Picture 1"/>
-            <wp:cNvGraphicFramePr>
-              <a:graphicFrameLocks xmlns:a="http://schemas.openxmlformats.org/drawingml/2006/main" noChangeAspect="1"/>
-            </wp:cNvGraphicFramePr>
-            <a:graphic xmlns:a="http://schemas.openxmlformats.org/drawingml/2006/main">
-              <a:graphicData uri="http://schemas.openxmlformats.org/drawingml/2006/picture">
-                <pic:pic xmlns:pic="http://schemas.openxmlformats.org/drawingml/2006/picture">
-                  <pic:nvPicPr>
-                    <pic:cNvPr id="1618677838" name=""/>
-                    <pic:cNvPicPr/>
-                  </pic:nvPicPr>
-                  <pic:blipFill>
-                    <a:blip r:embed="rId12"/>
-                    <a:stretch>
-                      <a:fillRect/>
-                    </a:stretch>
-                  </pic:blipFill>
-                  <pic:spPr>
-                    <a:xfrm>
-                      <a:off x="0" y="0"/>
-                      <a:ext cx="6120130" cy="7987665"/>
-                    </a:xfrm>
-                    <a:prstGeom prst="rect">
-                      <a:avLst/>
-                    </a:prstGeom>
-                  </pic:spPr>
-                </pic:pic>
-              </a:graphicData>
-            </a:graphic>
-          </wp:inline>
-        </w:drawing>
-      </w:r>
-    </w:p>
-    <w:p>
-      <w:pPr>
-        <w:jc w:val="both"/>
-      </w:pPr>
-      <w:r>
-        <w:lastRenderedPageBreak/>
-        <w:drawing>
-          <wp:inline distT="0" distB="0" distL="0" distR="0" wp14:anchorId="3F9440F2" wp14:editId="059C0B61">
-            <wp:extent cx="6120130" cy="8156575"/>
-            <wp:effectExtent l="0" t="0" r="0" b="0"/>
-            <wp:docPr id="583626709" name="Picture 1"/>
-            <wp:cNvGraphicFramePr>
-              <a:graphicFrameLocks xmlns:a="http://schemas.openxmlformats.org/drawingml/2006/main" noChangeAspect="1"/>
-            </wp:cNvGraphicFramePr>
-            <a:graphic xmlns:a="http://schemas.openxmlformats.org/drawingml/2006/main">
-              <a:graphicData uri="http://schemas.openxmlformats.org/drawingml/2006/picture">
-                <pic:pic xmlns:pic="http://schemas.openxmlformats.org/drawingml/2006/picture">
-                  <pic:nvPicPr>
-                    <pic:cNvPr id="583626709" name=""/>
-                    <pic:cNvPicPr/>
-                  </pic:nvPicPr>
-                  <pic:blipFill>
-                    <a:blip r:embed="rId13"/>
-                    <a:stretch>
-                      <a:fillRect/>
-                    </a:stretch>
-                  </pic:blipFill>
-                  <pic:spPr>
-                    <a:xfrm>
-                      <a:off x="0" y="0"/>
-                      <a:ext cx="6120130" cy="8156575"/>
-                    </a:xfrm>
-                    <a:prstGeom prst="rect">
-                      <a:avLst/>
-                    </a:prstGeom>
-                  </pic:spPr>
-                </pic:pic>
-              </a:graphicData>
-            </a:graphic>
-          </wp:inline>
-        </w:drawing>
-      </w:r>
-    </w:p>
-    <w:p>
-      <w:pPr>
-        <w:jc w:val="both"/>
-      </w:pPr>
-    </w:p>
-    <w:p>
-      <w:pPr>
-        <w:jc w:val="both"/>
-      </w:pPr>
-      <w:r>
-        <w:lastRenderedPageBreak/>
-        <w:t xml:space="preserve">For videre at bekræfte </w:t>
-      </w:r>
-      <w:r>
-        <w:t xml:space="preserve">”sundheden” </w:t>
-      </w:r>
-      <w:r>
-        <w:t xml:space="preserve">BVT-dataene </w:t>
-      </w:r>
-      <w:r>
-        <w:t xml:space="preserve">undersøger jeg sammensætningen af industrier for et givent år per udvalgt land. I elektrificeringsstatistikken er serviceydelser én kategori, hvorfor denne kommer til at fylde meget i følgende. Derfor </w:t>
-      </w:r>
-      <w:r>
-        <w:t xml:space="preserve">gentager jeg figuren </w:t>
-      </w:r>
-      <w:r>
-        <w:t>uden</w:t>
-      </w:r>
-      <w:r>
-        <w:t xml:space="preserve"> serviceydelser også.</w:t>
-      </w:r>
-    </w:p>
-    <w:p>
-      <w:pPr>
-        <w:jc w:val="both"/>
-      </w:pPr>
-      <w:r>
-        <w:drawing>
-          <wp:inline distT="0" distB="0" distL="0" distR="0" wp14:anchorId="679412DA" wp14:editId="36A4243D">
-            <wp:extent cx="6120130" cy="3232150"/>
-            <wp:effectExtent l="0" t="0" r="0" b="6350"/>
-            <wp:docPr id="1746110766" name="Picture 1"/>
-            <wp:cNvGraphicFramePr>
-              <a:graphicFrameLocks xmlns:a="http://schemas.openxmlformats.org/drawingml/2006/main" noChangeAspect="1"/>
-            </wp:cNvGraphicFramePr>
-            <a:graphic xmlns:a="http://schemas.openxmlformats.org/drawingml/2006/main">
-              <a:graphicData uri="http://schemas.openxmlformats.org/drawingml/2006/picture">
-                <pic:pic xmlns:pic="http://schemas.openxmlformats.org/drawingml/2006/picture">
-                  <pic:nvPicPr>
-                    <pic:cNvPr id="1746110766" name=""/>
-                    <pic:cNvPicPr/>
-                  </pic:nvPicPr>
-                  <pic:blipFill>
-                    <a:blip r:embed="rId14"/>
-                    <a:stretch>
-                      <a:fillRect/>
-                    </a:stretch>
-                  </pic:blipFill>
-                  <pic:spPr>
-                    <a:xfrm>
-                      <a:off x="0" y="0"/>
-                      <a:ext cx="6120130" cy="3232150"/>
-                    </a:xfrm>
-                    <a:prstGeom prst="rect">
-                      <a:avLst/>
-                    </a:prstGeom>
-                  </pic:spPr>
-                </pic:pic>
-              </a:graphicData>
-            </a:graphic>
-          </wp:inline>
-        </w:drawing>
-      </w:r>
-      <w:r>
-        <w:t xml:space="preserve"> </w:t>
-      </w:r>
-      <w:r>
-        <w:drawing>
-          <wp:inline distT="0" distB="0" distL="0" distR="0" wp14:anchorId="51F065D2" wp14:editId="7EBBB955">
-            <wp:extent cx="6120130" cy="2524125"/>
-            <wp:effectExtent l="0" t="0" r="0" b="9525"/>
-            <wp:docPr id="379934404" name="Picture 1"/>
-            <wp:cNvGraphicFramePr>
-              <a:graphicFrameLocks xmlns:a="http://schemas.openxmlformats.org/drawingml/2006/main" noChangeAspect="1"/>
-            </wp:cNvGraphicFramePr>
-            <a:graphic xmlns:a="http://schemas.openxmlformats.org/drawingml/2006/main">
-              <a:graphicData uri="http://schemas.openxmlformats.org/drawingml/2006/picture">
-                <pic:pic xmlns:pic="http://schemas.openxmlformats.org/drawingml/2006/picture">
-                  <pic:nvPicPr>
-                    <pic:cNvPr id="379934404" name=""/>
-                    <pic:cNvPicPr/>
-                  </pic:nvPicPr>
-                  <pic:blipFill>
-                    <a:blip r:embed="rId15"/>
-                    <a:stretch>
-                      <a:fillRect/>
-                    </a:stretch>
-                  </pic:blipFill>
-                  <pic:spPr>
-                    <a:xfrm>
-                      <a:off x="0" y="0"/>
-                      <a:ext cx="6120130" cy="2524125"/>
-                    </a:xfrm>
-                    <a:prstGeom prst="rect">
-                      <a:avLst/>
-                    </a:prstGeom>
-                  </pic:spPr>
-                </pic:pic>
-              </a:graphicData>
-            </a:graphic>
-          </wp:inline>
-        </w:drawing>
-      </w:r>
-    </w:p>
-    <w:p>
-      <w:pPr>
-        <w:jc w:val="both"/>
-      </w:pPr>
-      <w:r>
-        <w:br w:type="page"/>
-      </w:r>
-    </w:p>
-    <w:p>
-      <w:pPr>
-        <w:jc w:val="both"/>
-      </w:pPr>
-      <w:r>
-        <w:lastRenderedPageBreak/>
-        <w:t xml:space="preserve">Sidst er selve dekomponeringsøvelsen, der søger at svare på, hvor meget af udviklingen over tid i elektrificeringsraten, som kommer fra hhv. skift i industrisammensætningen </w:t>
-      </w:r>
-      <w:r>
-        <w:t xml:space="preserve">og skift i elintensiteten indenfor industrier. </w:t>
-      </w:r>
-    </w:p>
-    <w:p>
-      <w:pPr>
-        <w:jc w:val="both"/>
-        <w:rPr>
-          <w:rFonts w:eastAsiaTheme="minorEastAsia"/>
+        <w:rPr>
+          <w:rFonts w:eastAsiaTheme="minorEastAsia"/>
+          <w:color w:val="FF0000"/>
         </w:rPr>
       </w:pPr>
       <w:r>
@@ -760,7 +495,21 @@
         <w:rPr>
           <w:rFonts w:eastAsiaTheme="minorEastAsia"/>
         </w:rPr>
-        <w:t xml:space="preserve">Dette kan gøres ved en shift-share dekomponering med </w:t>
+        <w:t>Dette kan gøres ved en shift-</w:t>
+      </w:r>
+      <w:proofErr w:type="spellStart"/>
+      <w:r>
+        <w:rPr>
+          <w:rFonts w:eastAsiaTheme="minorEastAsia"/>
+        </w:rPr>
+        <w:t>share</w:t>
+      </w:r>
+      <w:proofErr w:type="spellEnd"/>
+      <w:r>
+        <w:rPr>
+          <w:rFonts w:eastAsiaTheme="minorEastAsia"/>
+        </w:rPr>
+        <w:t xml:space="preserve"> dekomponering med </w:t>
       </w:r>
       <w:r>
         <w:rPr>
@@ -1094,123 +843,6 @@
             <w:rPr>
               <w:rFonts w:ascii="Cambria Math" w:eastAsiaTheme="minorEastAsia" w:hAnsi="Cambria Math"/>
             </w:rPr>
-            <m:t>+</m:t>
-          </m:r>
-          <m:nary>
-            <m:naryPr>
-              <m:chr m:val="∑"/>
-              <m:supHide m:val="1"/>
-              <m:ctrlPr>
-                <w:rPr>
-                  <w:rFonts w:ascii="Cambria Math" w:eastAsiaTheme="minorEastAsia" w:hAnsi="Cambria Math"/>
-                </w:rPr>
-              </m:ctrlPr>
-            </m:naryPr>
-            <m:sub>
-              <m:r>
-                <w:rPr>
-                  <w:rFonts w:ascii="Cambria Math" w:eastAsiaTheme="minorEastAsia" w:hAnsi="Cambria Math"/>
-                </w:rPr>
-                <m:t>i</m:t>
-              </m:r>
-              <m:ctrlPr>
-                <w:rPr>
-                  <w:rFonts w:ascii="Cambria Math" w:eastAsiaTheme="minorEastAsia" w:hAnsi="Cambria Math"/>
-                  <w:i/>
-                </w:rPr>
-              </m:ctrlPr>
-            </m:sub>
-            <m:sup>
-              <m:ctrlPr>
-                <w:rPr>
-                  <w:rFonts w:ascii="Cambria Math" w:eastAsiaTheme="minorEastAsia" w:hAnsi="Cambria Math"/>
-                  <w:i/>
-                </w:rPr>
-              </m:ctrlPr>
-            </m:sup>
-            <m:e>
-              <m:r>
-                <m:rPr>
-                  <m:sty m:val="p"/>
-                </m:rPr>
-                <w:rPr>
-                  <w:rFonts w:ascii="Cambria Math" w:eastAsiaTheme="minorEastAsia" w:hAnsi="Cambria Math"/>
-                </w:rPr>
-                <m:t>Δ</m:t>
-              </m:r>
-              <m:sSub>
-                <m:sSubPr>
-                  <m:ctrlPr>
-                    <w:rPr>
-                      <w:rFonts w:ascii="Cambria Math" w:eastAsiaTheme="minorEastAsia" w:hAnsi="Cambria Math"/>
-                      <w:i/>
-                    </w:rPr>
-                  </m:ctrlPr>
-                </m:sSubPr>
-                <m:e>
-                  <m:r>
-                    <w:rPr>
-                      <w:rFonts w:ascii="Cambria Math" w:eastAsiaTheme="minorEastAsia" w:hAnsi="Cambria Math"/>
-                    </w:rPr>
-                    <m:t>s</m:t>
-                  </m:r>
-                </m:e>
-                <m:sub>
-                  <m:r>
-                    <w:rPr>
-                      <w:rFonts w:ascii="Cambria Math" w:eastAsiaTheme="minorEastAsia" w:hAnsi="Cambria Math"/>
-                    </w:rPr>
-                    <m:t>i</m:t>
-                  </m:r>
-                </m:sub>
-              </m:sSub>
-              <m:ctrlPr>
-                <w:rPr>
-                  <w:rFonts w:ascii="Cambria Math" w:eastAsiaTheme="minorEastAsia" w:hAnsi="Cambria Math"/>
-                  <w:i/>
-                </w:rPr>
-              </m:ctrlPr>
-            </m:e>
-          </m:nary>
-          <m:r>
-            <m:rPr>
-              <m:sty m:val="p"/>
-            </m:rPr>
-            <w:rPr>
-              <w:rFonts w:ascii="Cambria Math" w:eastAsiaTheme="minorEastAsia" w:hAnsi="Cambria Math"/>
-            </w:rPr>
-            <m:t>⋅Δ</m:t>
-          </m:r>
-          <m:sSub>
-            <m:sSubPr>
-              <m:ctrlPr>
-                <w:rPr>
-                  <w:rFonts w:ascii="Cambria Math" w:eastAsiaTheme="minorEastAsia" w:hAnsi="Cambria Math"/>
-                  <w:i/>
-                </w:rPr>
-              </m:ctrlPr>
-            </m:sSubPr>
-            <m:e>
-              <m:r>
-                <w:rPr>
-                  <w:rFonts w:ascii="Cambria Math" w:eastAsiaTheme="minorEastAsia" w:hAnsi="Cambria Math"/>
-                </w:rPr>
-                <m:t>e</m:t>
-              </m:r>
-            </m:e>
-            <m:sub>
-              <m:r>
-                <w:rPr>
-                  <w:rFonts w:ascii="Cambria Math" w:eastAsiaTheme="minorEastAsia" w:hAnsi="Cambria Math"/>
-                </w:rPr>
-                <m:t>i</m:t>
-              </m:r>
-            </m:sub>
-          </m:sSub>
-          <m:r>
-            <w:rPr>
-              <w:rFonts w:ascii="Cambria Math" w:eastAsiaTheme="minorEastAsia" w:hAnsi="Cambria Math"/>
-            </w:rPr>
             <m:t>,</m:t>
           </m:r>
           <m:r>
@@ -1572,10 +1204,10 @@
           <w:rFonts w:eastAsiaTheme="minorEastAsia"/>
         </w:rPr>
         <w:drawing>
-          <wp:inline distT="0" distB="0" distL="0" distR="0" wp14:anchorId="0DEB4A38" wp14:editId="0B14442C">
-            <wp:extent cx="6120130" cy="2016125"/>
-            <wp:effectExtent l="0" t="0" r="0" b="3175"/>
-            <wp:docPr id="1798550096" name="Picture 1"/>
+          <wp:inline distT="0" distB="0" distL="0" distR="0" wp14:anchorId="650E90E5" wp14:editId="1459BCF9">
+            <wp:extent cx="6120130" cy="2529205"/>
+            <wp:effectExtent l="0" t="0" r="0" b="4445"/>
+            <wp:docPr id="1350847877" name="Picture 1"/>
             <wp:cNvGraphicFramePr>
               <a:graphicFrameLocks xmlns:a="http://schemas.openxmlformats.org/drawingml/2006/main" noChangeAspect="1"/>
             </wp:cNvGraphicFramePr>
@@ -1583,11 +1215,11 @@
               <a:graphicData uri="http://schemas.openxmlformats.org/drawingml/2006/picture">
                 <pic:pic xmlns:pic="http://schemas.openxmlformats.org/drawingml/2006/picture">
                   <pic:nvPicPr>
-                    <pic:cNvPr id="1798550096" name=""/>
+                    <pic:cNvPr id="1350847877" name=""/>
                     <pic:cNvPicPr/>
                   </pic:nvPicPr>
                   <pic:blipFill>
-                    <a:blip r:embed="rId16"/>
+                    <a:blip r:embed="rId12"/>
                     <a:stretch>
                       <a:fillRect/>
                     </a:stretch>
@@ -1595,7 +1227,7 @@
                   <pic:spPr>
                     <a:xfrm>
                       <a:off x="0" y="0"/>
-                      <a:ext cx="6120130" cy="2016125"/>
+                      <a:ext cx="6120130" cy="2529205"/>
                     </a:xfrm>
                     <a:prstGeom prst="rect">
                       <a:avLst/>
@@ -1610,6 +1242,19 @@
     </w:p>
     <w:p>
       <w:pPr>
+        <w:rPr>
+          <w:rFonts w:eastAsiaTheme="minorEastAsia"/>
+        </w:rPr>
+      </w:pPr>
+      <w:r>
+        <w:rPr>
+          <w:rFonts w:eastAsiaTheme="minorEastAsia"/>
+        </w:rPr>
+        <w:br w:type="page"/>
+      </w:r>
+    </w:p>
+    <w:p>
+      <w:pPr>
         <w:jc w:val="both"/>
         <w:rPr>
           <w:rFonts w:eastAsiaTheme="minorEastAsia"/>
@@ -1618,43 +1263,3290 @@
       <w:r>
         <w:rPr>
           <w:rFonts w:eastAsiaTheme="minorEastAsia"/>
-        </w:rPr>
-        <w:drawing>
-          <wp:inline distT="0" distB="0" distL="0" distR="0" wp14:anchorId="69A6BC66" wp14:editId="6D9E413E">
-            <wp:extent cx="6120130" cy="2016125"/>
-            <wp:effectExtent l="0" t="0" r="0" b="3175"/>
-            <wp:docPr id="2111945716" name="Picture 1"/>
-            <wp:cNvGraphicFramePr>
-              <a:graphicFrameLocks xmlns:a="http://schemas.openxmlformats.org/drawingml/2006/main" noChangeAspect="1"/>
-            </wp:cNvGraphicFramePr>
-            <a:graphic xmlns:a="http://schemas.openxmlformats.org/drawingml/2006/main">
-              <a:graphicData uri="http://schemas.openxmlformats.org/drawingml/2006/picture">
-                <pic:pic xmlns:pic="http://schemas.openxmlformats.org/drawingml/2006/picture">
-                  <pic:nvPicPr>
-                    <pic:cNvPr id="2111945716" name=""/>
-                    <pic:cNvPicPr/>
-                  </pic:nvPicPr>
-                  <pic:blipFill>
-                    <a:blip r:embed="rId17"/>
-                    <a:stretch>
-                      <a:fillRect/>
-                    </a:stretch>
-                  </pic:blipFill>
-                  <pic:spPr>
-                    <a:xfrm>
-                      <a:off x="0" y="0"/>
-                      <a:ext cx="6120130" cy="2016125"/>
-                    </a:xfrm>
-                    <a:prstGeom prst="rect">
-                      <a:avLst/>
-                    </a:prstGeom>
-                  </pic:spPr>
-                </pic:pic>
-              </a:graphicData>
-            </a:graphic>
-          </wp:inline>
-        </w:drawing>
-      </w:r>
+          <w:b/>
+          <w:bCs/>
+        </w:rPr>
+        <w:lastRenderedPageBreak/>
+        <w:t>Definitioner</w:t>
+      </w:r>
+      <w:r>
+        <w:rPr>
+          <w:rFonts w:eastAsiaTheme="minorEastAsia"/>
+          <w:b/>
+          <w:bCs/>
+        </w:rPr>
+        <w:t>:</w:t>
+      </w:r>
+      <w:r>
+        <w:rPr>
+          <w:rFonts w:eastAsiaTheme="minorEastAsia"/>
+        </w:rPr>
+        <w:t xml:space="preserve"> </w:t>
+      </w:r>
+      <w:r>
+        <w:rPr>
+          <w:rFonts w:eastAsiaTheme="minorEastAsia"/>
+        </w:rPr>
+        <w:t>Elektr</w:t>
+      </w:r>
+      <w:r>
+        <w:rPr>
+          <w:rFonts w:eastAsiaTheme="minorEastAsia"/>
+        </w:rPr>
+        <w:t>i</w:t>
+      </w:r>
+      <w:r>
+        <w:rPr>
+          <w:rFonts w:eastAsiaTheme="minorEastAsia"/>
+        </w:rPr>
+        <w:t xml:space="preserve">ficeringsraten er den energivægtede sum af </w:t>
+      </w:r>
+      <w:r>
+        <w:rPr>
+          <w:rFonts w:eastAsiaTheme="minorEastAsia"/>
+        </w:rPr>
+        <w:t xml:space="preserve">sektor </w:t>
+      </w:r>
+      <m:oMath>
+        <m:r>
+          <w:rPr>
+            <w:rFonts w:ascii="Cambria Math" w:eastAsiaTheme="minorEastAsia" w:hAnsi="Cambria Math"/>
+          </w:rPr>
+          <m:t>i</m:t>
+        </m:r>
+      </m:oMath>
+      <w:r>
+        <w:rPr>
+          <w:rFonts w:eastAsiaTheme="minorEastAsia"/>
+        </w:rPr>
+        <w:t xml:space="preserve">’s andel af det samlede energiforbrug, </w:t>
+      </w:r>
+      <m:oMath>
+        <m:sSub>
+          <m:sSubPr>
+            <m:ctrlPr>
+              <w:rPr>
+                <w:rFonts w:ascii="Cambria Math" w:eastAsiaTheme="minorEastAsia" w:hAnsi="Cambria Math"/>
+                <w:i/>
+              </w:rPr>
+            </m:ctrlPr>
+          </m:sSubPr>
+          <m:e>
+            <m:r>
+              <w:rPr>
+                <w:rFonts w:ascii="Cambria Math" w:eastAsiaTheme="minorEastAsia" w:hAnsi="Cambria Math"/>
+              </w:rPr>
+              <m:t>s</m:t>
+            </m:r>
+          </m:e>
+          <m:sub>
+            <m:r>
+              <w:rPr>
+                <w:rFonts w:ascii="Cambria Math" w:eastAsiaTheme="minorEastAsia" w:hAnsi="Cambria Math"/>
+              </w:rPr>
+              <m:t>i,t</m:t>
+            </m:r>
+          </m:sub>
+        </m:sSub>
+      </m:oMath>
+      <w:r>
+        <w:rPr>
+          <w:rFonts w:eastAsiaTheme="minorEastAsia"/>
+        </w:rPr>
+        <w:t xml:space="preserve">, </w:t>
+      </w:r>
+      <w:r>
+        <w:rPr>
+          <w:rFonts w:eastAsiaTheme="minorEastAsia"/>
+        </w:rPr>
+        <w:t xml:space="preserve">og af dens elektrificeringsrate </w:t>
+      </w:r>
+      <m:oMath>
+        <m:sSub>
+          <m:sSubPr>
+            <m:ctrlPr>
+              <w:rPr>
+                <w:rFonts w:ascii="Cambria Math" w:eastAsiaTheme="minorEastAsia" w:hAnsi="Cambria Math"/>
+                <w:i/>
+              </w:rPr>
+            </m:ctrlPr>
+          </m:sSubPr>
+          <m:e>
+            <m:r>
+              <w:rPr>
+                <w:rFonts w:ascii="Cambria Math" w:eastAsiaTheme="minorEastAsia" w:hAnsi="Cambria Math"/>
+              </w:rPr>
+              <m:t>e</m:t>
+            </m:r>
+          </m:e>
+          <m:sub>
+            <m:r>
+              <w:rPr>
+                <w:rFonts w:ascii="Cambria Math" w:eastAsiaTheme="minorEastAsia" w:hAnsi="Cambria Math"/>
+              </w:rPr>
+              <m:t>i,t</m:t>
+            </m:r>
+          </m:sub>
+        </m:sSub>
+      </m:oMath>
+      <w:r>
+        <w:rPr>
+          <w:rFonts w:eastAsiaTheme="minorEastAsia"/>
+        </w:rPr>
+        <w:t>.</w:t>
+      </w:r>
+      <w:r>
+        <w:rPr>
+          <w:rFonts w:eastAsiaTheme="minorEastAsia"/>
+        </w:rPr>
+        <w:t xml:space="preserve"> </w:t>
+      </w:r>
+    </w:p>
+    <w:p>
+      <w:pPr>
+        <w:jc w:val="both"/>
+        <w:rPr>
+          <w:rFonts w:eastAsiaTheme="minorEastAsia"/>
+        </w:rPr>
+      </w:pPr>
+      <m:oMathPara>
+        <m:oMath>
+          <m:sSub>
+            <m:sSubPr>
+              <m:ctrlPr>
+                <w:rPr>
+                  <w:rFonts w:ascii="Cambria Math" w:eastAsiaTheme="minorEastAsia" w:hAnsi="Cambria Math"/>
+                  <w:i/>
+                </w:rPr>
+              </m:ctrlPr>
+            </m:sSubPr>
+            <m:e>
+              <m:r>
+                <w:rPr>
+                  <w:rFonts w:ascii="Cambria Math" w:eastAsiaTheme="minorEastAsia" w:hAnsi="Cambria Math"/>
+                </w:rPr>
+                <m:t>E</m:t>
+              </m:r>
+            </m:e>
+            <m:sub>
+              <m:r>
+                <w:rPr>
+                  <w:rFonts w:ascii="Cambria Math" w:eastAsiaTheme="minorEastAsia" w:hAnsi="Cambria Math"/>
+                </w:rPr>
+                <m:t>t</m:t>
+              </m:r>
+            </m:sub>
+          </m:sSub>
+          <m:r>
+            <w:rPr>
+              <w:rFonts w:ascii="Cambria Math" w:eastAsiaTheme="minorEastAsia" w:hAnsi="Cambria Math"/>
+            </w:rPr>
+            <m:t>=</m:t>
+          </m:r>
+          <m:nary>
+            <m:naryPr>
+              <m:chr m:val="∑"/>
+              <m:supHide m:val="1"/>
+              <m:ctrlPr>
+                <w:rPr>
+                  <w:rFonts w:ascii="Cambria Math" w:eastAsiaTheme="minorEastAsia" w:hAnsi="Cambria Math"/>
+                </w:rPr>
+              </m:ctrlPr>
+            </m:naryPr>
+            <m:sub>
+              <m:r>
+                <w:rPr>
+                  <w:rFonts w:ascii="Cambria Math" w:eastAsiaTheme="minorEastAsia" w:hAnsi="Cambria Math"/>
+                </w:rPr>
+                <m:t>i</m:t>
+              </m:r>
+              <m:ctrlPr>
+                <w:rPr>
+                  <w:rFonts w:ascii="Cambria Math" w:eastAsiaTheme="minorEastAsia" w:hAnsi="Cambria Math"/>
+                  <w:i/>
+                </w:rPr>
+              </m:ctrlPr>
+            </m:sub>
+            <m:sup>
+              <m:ctrlPr>
+                <w:rPr>
+                  <w:rFonts w:ascii="Cambria Math" w:eastAsiaTheme="minorEastAsia" w:hAnsi="Cambria Math"/>
+                  <w:i/>
+                </w:rPr>
+              </m:ctrlPr>
+            </m:sup>
+            <m:e>
+              <m:sSub>
+                <m:sSubPr>
+                  <m:ctrlPr>
+                    <w:rPr>
+                      <w:rFonts w:ascii="Cambria Math" w:eastAsiaTheme="minorEastAsia" w:hAnsi="Cambria Math"/>
+                      <w:i/>
+                    </w:rPr>
+                  </m:ctrlPr>
+                </m:sSubPr>
+                <m:e>
+                  <m:r>
+                    <w:rPr>
+                      <w:rFonts w:ascii="Cambria Math" w:eastAsiaTheme="minorEastAsia" w:hAnsi="Cambria Math"/>
+                    </w:rPr>
+                    <m:t>s</m:t>
+                  </m:r>
+                </m:e>
+                <m:sub>
+                  <m:r>
+                    <w:rPr>
+                      <w:rFonts w:ascii="Cambria Math" w:eastAsiaTheme="minorEastAsia" w:hAnsi="Cambria Math"/>
+                    </w:rPr>
+                    <m:t>i,t</m:t>
+                  </m:r>
+                </m:sub>
+              </m:sSub>
+              <m:sSub>
+                <m:sSubPr>
+                  <m:ctrlPr>
+                    <w:rPr>
+                      <w:rFonts w:ascii="Cambria Math" w:eastAsiaTheme="minorEastAsia" w:hAnsi="Cambria Math"/>
+                      <w:i/>
+                    </w:rPr>
+                  </m:ctrlPr>
+                </m:sSubPr>
+                <m:e>
+                  <m:r>
+                    <w:rPr>
+                      <w:rFonts w:ascii="Cambria Math" w:eastAsiaTheme="minorEastAsia" w:hAnsi="Cambria Math"/>
+                    </w:rPr>
+                    <m:t>e</m:t>
+                  </m:r>
+                </m:e>
+                <m:sub>
+                  <m:r>
+                    <w:rPr>
+                      <w:rFonts w:ascii="Cambria Math" w:eastAsiaTheme="minorEastAsia" w:hAnsi="Cambria Math"/>
+                    </w:rPr>
+                    <m:t>i,t</m:t>
+                  </m:r>
+                </m:sub>
+              </m:sSub>
+              <m:ctrlPr>
+                <w:rPr>
+                  <w:rFonts w:ascii="Cambria Math" w:eastAsiaTheme="minorEastAsia" w:hAnsi="Cambria Math"/>
+                  <w:i/>
+                </w:rPr>
+              </m:ctrlPr>
+            </m:e>
+          </m:nary>
+        </m:oMath>
+      </m:oMathPara>
+    </w:p>
+    <w:p>
+      <w:pPr>
+        <w:jc w:val="both"/>
+        <w:rPr>
+          <w:rFonts w:eastAsiaTheme="minorEastAsia"/>
+        </w:rPr>
+      </w:pPr>
+      <w:r>
+        <w:rPr>
+          <w:rFonts w:eastAsiaTheme="minorEastAsia"/>
+        </w:rPr>
+        <w:t xml:space="preserve">Jeg sammenligner da to tidspunkter </w:t>
+      </w:r>
+      <m:oMath>
+        <m:r>
+          <w:rPr>
+            <w:rFonts w:ascii="Cambria Math" w:eastAsiaTheme="minorEastAsia" w:hAnsi="Cambria Math"/>
+          </w:rPr>
+          <m:t>t</m:t>
+        </m:r>
+        <m:r>
+          <m:rPr>
+            <m:sty m:val="p"/>
+          </m:rPr>
+          <w:rPr>
+            <w:rFonts w:ascii="Cambria Math" w:eastAsiaTheme="minorEastAsia" w:hAnsi="Cambria Math"/>
+          </w:rPr>
+          <m:t>∈</m:t>
+        </m:r>
+        <m:r>
+          <m:rPr>
+            <m:lit/>
+          </m:rPr>
+          <w:rPr>
+            <w:rFonts w:ascii="Cambria Math" w:eastAsiaTheme="minorEastAsia" w:hAnsi="Cambria Math"/>
+          </w:rPr>
+          <m:t>{</m:t>
+        </m:r>
+        <m:r>
+          <w:rPr>
+            <w:rFonts w:ascii="Cambria Math" w:eastAsiaTheme="minorEastAsia" w:hAnsi="Cambria Math"/>
+          </w:rPr>
+          <m:t>0,1</m:t>
+        </m:r>
+        <m:r>
+          <m:rPr>
+            <m:lit/>
+          </m:rPr>
+          <w:rPr>
+            <w:rFonts w:ascii="Cambria Math" w:eastAsiaTheme="minorEastAsia" w:hAnsi="Cambria Math"/>
+          </w:rPr>
+          <m:t>}</m:t>
+        </m:r>
+      </m:oMath>
+      <w:r>
+        <w:rPr>
+          <w:rFonts w:eastAsiaTheme="minorEastAsia"/>
+        </w:rPr>
+        <w:t>. Jeg definerer vægte som ”midtvejspunkterne”, dvs.</w:t>
+      </w:r>
+    </w:p>
+    <w:p>
+      <w:pPr>
+        <w:jc w:val="both"/>
+        <w:rPr>
+          <w:rFonts w:eastAsiaTheme="minorEastAsia"/>
+        </w:rPr>
+      </w:pPr>
+      <m:oMathPara>
+        <m:oMath>
+          <m:acc>
+            <m:accPr>
+              <m:chr m:val="̅"/>
+              <m:ctrlPr>
+                <w:rPr>
+                  <w:rFonts w:ascii="Cambria Math" w:eastAsiaTheme="minorEastAsia" w:hAnsi="Cambria Math"/>
+                </w:rPr>
+              </m:ctrlPr>
+            </m:accPr>
+            <m:e>
+              <m:sSub>
+                <m:sSubPr>
+                  <m:ctrlPr>
+                    <w:rPr>
+                      <w:rFonts w:ascii="Cambria Math" w:eastAsiaTheme="minorEastAsia" w:hAnsi="Cambria Math"/>
+                      <w:i/>
+                    </w:rPr>
+                  </m:ctrlPr>
+                </m:sSubPr>
+                <m:e>
+                  <m:r>
+                    <w:rPr>
+                      <w:rFonts w:ascii="Cambria Math" w:eastAsiaTheme="minorEastAsia" w:hAnsi="Cambria Math"/>
+                    </w:rPr>
+                    <m:t>s</m:t>
+                  </m:r>
+                  <m:ctrlPr>
+                    <w:rPr>
+                      <w:rFonts w:ascii="Cambria Math" w:eastAsiaTheme="minorEastAsia" w:hAnsi="Cambria Math"/>
+                    </w:rPr>
+                  </m:ctrlPr>
+                </m:e>
+                <m:sub>
+                  <m:r>
+                    <w:rPr>
+                      <w:rFonts w:ascii="Cambria Math" w:eastAsiaTheme="minorEastAsia" w:hAnsi="Cambria Math"/>
+                    </w:rPr>
+                    <m:t>i</m:t>
+                  </m:r>
+                </m:sub>
+              </m:sSub>
+            </m:e>
+          </m:acc>
+          <m:r>
+            <w:rPr>
+              <w:rFonts w:ascii="Cambria Math" w:eastAsiaTheme="minorEastAsia" w:hAnsi="Cambria Math"/>
+            </w:rPr>
+            <m:t>=</m:t>
+          </m:r>
+          <m:f>
+            <m:fPr>
+              <m:ctrlPr>
+                <w:rPr>
+                  <w:rFonts w:ascii="Cambria Math" w:eastAsiaTheme="minorEastAsia" w:hAnsi="Cambria Math"/>
+                </w:rPr>
+              </m:ctrlPr>
+            </m:fPr>
+            <m:num>
+              <m:sSub>
+                <m:sSubPr>
+                  <m:ctrlPr>
+                    <w:rPr>
+                      <w:rFonts w:ascii="Cambria Math" w:eastAsiaTheme="minorEastAsia" w:hAnsi="Cambria Math"/>
+                      <w:i/>
+                    </w:rPr>
+                  </m:ctrlPr>
+                </m:sSubPr>
+                <m:e>
+                  <m:r>
+                    <w:rPr>
+                      <w:rFonts w:ascii="Cambria Math" w:eastAsiaTheme="minorEastAsia" w:hAnsi="Cambria Math"/>
+                    </w:rPr>
+                    <m:t>s</m:t>
+                  </m:r>
+                </m:e>
+                <m:sub>
+                  <m:r>
+                    <w:rPr>
+                      <w:rFonts w:ascii="Cambria Math" w:eastAsiaTheme="minorEastAsia" w:hAnsi="Cambria Math"/>
+                    </w:rPr>
+                    <m:t>i,0</m:t>
+                  </m:r>
+                </m:sub>
+              </m:sSub>
+              <m:r>
+                <w:rPr>
+                  <w:rFonts w:ascii="Cambria Math" w:eastAsiaTheme="minorEastAsia" w:hAnsi="Cambria Math"/>
+                </w:rPr>
+                <m:t>+</m:t>
+              </m:r>
+              <m:sSub>
+                <m:sSubPr>
+                  <m:ctrlPr>
+                    <w:rPr>
+                      <w:rFonts w:ascii="Cambria Math" w:eastAsiaTheme="minorEastAsia" w:hAnsi="Cambria Math"/>
+                      <w:i/>
+                    </w:rPr>
+                  </m:ctrlPr>
+                </m:sSubPr>
+                <m:e>
+                  <m:r>
+                    <w:rPr>
+                      <w:rFonts w:ascii="Cambria Math" w:eastAsiaTheme="minorEastAsia" w:hAnsi="Cambria Math"/>
+                    </w:rPr>
+                    <m:t>s</m:t>
+                  </m:r>
+                </m:e>
+                <m:sub>
+                  <m:r>
+                    <w:rPr>
+                      <w:rFonts w:ascii="Cambria Math" w:eastAsiaTheme="minorEastAsia" w:hAnsi="Cambria Math"/>
+                    </w:rPr>
+                    <m:t>i</m:t>
+                  </m:r>
+                  <m:r>
+                    <w:rPr>
+                      <w:rFonts w:ascii="Cambria Math" w:eastAsiaTheme="minorEastAsia" w:hAnsi="Cambria Math"/>
+                    </w:rPr>
+                    <m:t>,</m:t>
+                  </m:r>
+                  <m:r>
+                    <w:rPr>
+                      <w:rFonts w:ascii="Cambria Math" w:eastAsiaTheme="minorEastAsia" w:hAnsi="Cambria Math"/>
+                    </w:rPr>
+                    <m:t>1</m:t>
+                  </m:r>
+                </m:sub>
+              </m:sSub>
+              <m:ctrlPr>
+                <w:rPr>
+                  <w:rFonts w:ascii="Cambria Math" w:eastAsiaTheme="minorEastAsia" w:hAnsi="Cambria Math"/>
+                  <w:i/>
+                </w:rPr>
+              </m:ctrlPr>
+            </m:num>
+            <m:den>
+              <m:r>
+                <w:rPr>
+                  <w:rFonts w:ascii="Cambria Math" w:eastAsiaTheme="minorEastAsia" w:hAnsi="Cambria Math"/>
+                </w:rPr>
+                <m:t>2</m:t>
+              </m:r>
+              <m:ctrlPr>
+                <w:rPr>
+                  <w:rFonts w:ascii="Cambria Math" w:eastAsiaTheme="minorEastAsia" w:hAnsi="Cambria Math"/>
+                  <w:i/>
+                </w:rPr>
+              </m:ctrlPr>
+            </m:den>
+          </m:f>
+          <m:r>
+            <w:rPr>
+              <w:rFonts w:ascii="Cambria Math" w:eastAsiaTheme="minorEastAsia" w:hAnsi="Cambria Math"/>
+            </w:rPr>
+            <m:t>,</m:t>
+          </m:r>
+          <m:r>
+            <m:rPr>
+              <m:sty m:val="p"/>
+            </m:rPr>
+            <w:rPr>
+              <w:rFonts w:ascii="Cambria Math" w:eastAsiaTheme="minorEastAsia" w:hAnsi="Cambria Math"/>
+            </w:rPr>
+            <m:t>  </m:t>
+          </m:r>
+          <m:acc>
+            <m:accPr>
+              <m:chr m:val="̅"/>
+              <m:ctrlPr>
+                <w:rPr>
+                  <w:rFonts w:ascii="Cambria Math" w:eastAsiaTheme="minorEastAsia" w:hAnsi="Cambria Math"/>
+                </w:rPr>
+              </m:ctrlPr>
+            </m:accPr>
+            <m:e>
+              <m:sSub>
+                <m:sSubPr>
+                  <m:ctrlPr>
+                    <w:rPr>
+                      <w:rFonts w:ascii="Cambria Math" w:eastAsiaTheme="minorEastAsia" w:hAnsi="Cambria Math"/>
+                      <w:i/>
+                    </w:rPr>
+                  </m:ctrlPr>
+                </m:sSubPr>
+                <m:e>
+                  <m:r>
+                    <w:rPr>
+                      <w:rFonts w:ascii="Cambria Math" w:eastAsiaTheme="minorEastAsia" w:hAnsi="Cambria Math"/>
+                    </w:rPr>
+                    <m:t>e</m:t>
+                  </m:r>
+                  <m:ctrlPr>
+                    <w:rPr>
+                      <w:rFonts w:ascii="Cambria Math" w:eastAsiaTheme="minorEastAsia" w:hAnsi="Cambria Math"/>
+                    </w:rPr>
+                  </m:ctrlPr>
+                </m:e>
+                <m:sub>
+                  <m:r>
+                    <w:rPr>
+                      <w:rFonts w:ascii="Cambria Math" w:eastAsiaTheme="minorEastAsia" w:hAnsi="Cambria Math"/>
+                    </w:rPr>
+                    <m:t>i</m:t>
+                  </m:r>
+                </m:sub>
+              </m:sSub>
+            </m:e>
+          </m:acc>
+          <m:r>
+            <w:rPr>
+              <w:rFonts w:ascii="Cambria Math" w:eastAsiaTheme="minorEastAsia" w:hAnsi="Cambria Math"/>
+            </w:rPr>
+            <m:t>=</m:t>
+          </m:r>
+          <m:f>
+            <m:fPr>
+              <m:ctrlPr>
+                <w:rPr>
+                  <w:rFonts w:ascii="Cambria Math" w:eastAsiaTheme="minorEastAsia" w:hAnsi="Cambria Math"/>
+                </w:rPr>
+              </m:ctrlPr>
+            </m:fPr>
+            <m:num>
+              <m:sSub>
+                <m:sSubPr>
+                  <m:ctrlPr>
+                    <w:rPr>
+                      <w:rFonts w:ascii="Cambria Math" w:eastAsiaTheme="minorEastAsia" w:hAnsi="Cambria Math"/>
+                      <w:i/>
+                    </w:rPr>
+                  </m:ctrlPr>
+                </m:sSubPr>
+                <m:e>
+                  <m:r>
+                    <w:rPr>
+                      <w:rFonts w:ascii="Cambria Math" w:eastAsiaTheme="minorEastAsia" w:hAnsi="Cambria Math"/>
+                    </w:rPr>
+                    <m:t>e</m:t>
+                  </m:r>
+                </m:e>
+                <m:sub>
+                  <m:r>
+                    <w:rPr>
+                      <w:rFonts w:ascii="Cambria Math" w:eastAsiaTheme="minorEastAsia" w:hAnsi="Cambria Math"/>
+                    </w:rPr>
+                    <m:t>i</m:t>
+                  </m:r>
+                  <m:r>
+                    <w:rPr>
+                      <w:rFonts w:ascii="Cambria Math" w:eastAsiaTheme="minorEastAsia" w:hAnsi="Cambria Math"/>
+                    </w:rPr>
+                    <m:t>,0</m:t>
+                  </m:r>
+                </m:sub>
+              </m:sSub>
+              <m:r>
+                <w:rPr>
+                  <w:rFonts w:ascii="Cambria Math" w:eastAsiaTheme="minorEastAsia" w:hAnsi="Cambria Math"/>
+                </w:rPr>
+                <m:t>+</m:t>
+              </m:r>
+              <m:sSub>
+                <m:sSubPr>
+                  <m:ctrlPr>
+                    <w:rPr>
+                      <w:rFonts w:ascii="Cambria Math" w:eastAsiaTheme="minorEastAsia" w:hAnsi="Cambria Math"/>
+                      <w:i/>
+                    </w:rPr>
+                  </m:ctrlPr>
+                </m:sSubPr>
+                <m:e>
+                  <m:r>
+                    <w:rPr>
+                      <w:rFonts w:ascii="Cambria Math" w:eastAsiaTheme="minorEastAsia" w:hAnsi="Cambria Math"/>
+                    </w:rPr>
+                    <m:t>e</m:t>
+                  </m:r>
+                </m:e>
+                <m:sub>
+                  <m:r>
+                    <w:rPr>
+                      <w:rFonts w:ascii="Cambria Math" w:eastAsiaTheme="minorEastAsia" w:hAnsi="Cambria Math"/>
+                    </w:rPr>
+                    <m:t>i</m:t>
+                  </m:r>
+                  <m:r>
+                    <w:rPr>
+                      <w:rFonts w:ascii="Cambria Math" w:eastAsiaTheme="minorEastAsia" w:hAnsi="Cambria Math"/>
+                    </w:rPr>
+                    <m:t>,</m:t>
+                  </m:r>
+                  <m:r>
+                    <w:rPr>
+                      <w:rFonts w:ascii="Cambria Math" w:eastAsiaTheme="minorEastAsia" w:hAnsi="Cambria Math"/>
+                    </w:rPr>
+                    <m:t>1</m:t>
+                  </m:r>
+                </m:sub>
+              </m:sSub>
+              <m:ctrlPr>
+                <w:rPr>
+                  <w:rFonts w:ascii="Cambria Math" w:eastAsiaTheme="minorEastAsia" w:hAnsi="Cambria Math"/>
+                  <w:i/>
+                </w:rPr>
+              </m:ctrlPr>
+            </m:num>
+            <m:den>
+              <m:r>
+                <w:rPr>
+                  <w:rFonts w:ascii="Cambria Math" w:eastAsiaTheme="minorEastAsia" w:hAnsi="Cambria Math"/>
+                </w:rPr>
+                <m:t>2</m:t>
+              </m:r>
+              <m:ctrlPr>
+                <w:rPr>
+                  <w:rFonts w:ascii="Cambria Math" w:eastAsiaTheme="minorEastAsia" w:hAnsi="Cambria Math"/>
+                  <w:i/>
+                </w:rPr>
+              </m:ctrlPr>
+            </m:den>
+          </m:f>
+          <m:r>
+            <w:rPr>
+              <w:rFonts w:ascii="Cambria Math" w:eastAsiaTheme="minorEastAsia" w:hAnsi="Cambria Math"/>
+            </w:rPr>
+            <m:t>.</m:t>
+          </m:r>
+        </m:oMath>
+      </m:oMathPara>
+    </w:p>
+    <w:p>
+      <w:pPr>
+        <w:jc w:val="both"/>
+        <w:rPr>
+          <w:rFonts w:eastAsiaTheme="minorEastAsia"/>
+        </w:rPr>
+      </w:pPr>
+      <w:r>
+        <w:rPr>
+          <w:rFonts w:eastAsiaTheme="minorEastAsia"/>
+        </w:rPr>
+        <w:t xml:space="preserve">Lad desuden ændringer være givet ved: </w:t>
+      </w:r>
+      <m:oMath>
+        <m:r>
+          <m:rPr>
+            <m:sty m:val="p"/>
+          </m:rPr>
+          <w:rPr>
+            <w:rFonts w:ascii="Cambria Math" w:eastAsiaTheme="minorEastAsia" w:hAnsi="Cambria Math"/>
+          </w:rPr>
+          <m:t>Δ</m:t>
+        </m:r>
+        <m:sSub>
+          <m:sSubPr>
+            <m:ctrlPr>
+              <w:rPr>
+                <w:rFonts w:ascii="Cambria Math" w:eastAsiaTheme="minorEastAsia" w:hAnsi="Cambria Math"/>
+                <w:i/>
+              </w:rPr>
+            </m:ctrlPr>
+          </m:sSubPr>
+          <m:e>
+            <m:r>
+              <w:rPr>
+                <w:rFonts w:ascii="Cambria Math" w:eastAsiaTheme="minorEastAsia" w:hAnsi="Cambria Math"/>
+              </w:rPr>
+              <m:t>s</m:t>
+            </m:r>
+          </m:e>
+          <m:sub>
+            <m:r>
+              <w:rPr>
+                <w:rFonts w:ascii="Cambria Math" w:eastAsiaTheme="minorEastAsia" w:hAnsi="Cambria Math"/>
+              </w:rPr>
+              <m:t>i</m:t>
+            </m:r>
+          </m:sub>
+        </m:sSub>
+        <m:r>
+          <w:rPr>
+            <w:rFonts w:ascii="Cambria Math" w:eastAsiaTheme="minorEastAsia" w:hAnsi="Cambria Math"/>
+          </w:rPr>
+          <m:t>=</m:t>
+        </m:r>
+        <m:sSub>
+          <m:sSubPr>
+            <m:ctrlPr>
+              <w:rPr>
+                <w:rFonts w:ascii="Cambria Math" w:eastAsiaTheme="minorEastAsia" w:hAnsi="Cambria Math"/>
+                <w:i/>
+              </w:rPr>
+            </m:ctrlPr>
+          </m:sSubPr>
+          <m:e>
+            <m:r>
+              <w:rPr>
+                <w:rFonts w:ascii="Cambria Math" w:eastAsiaTheme="minorEastAsia" w:hAnsi="Cambria Math"/>
+              </w:rPr>
+              <m:t>s</m:t>
+            </m:r>
+          </m:e>
+          <m:sub>
+            <m:r>
+              <w:rPr>
+                <w:rFonts w:ascii="Cambria Math" w:eastAsiaTheme="minorEastAsia" w:hAnsi="Cambria Math"/>
+              </w:rPr>
+              <m:t>i,1</m:t>
+            </m:r>
+          </m:sub>
+        </m:sSub>
+        <m:r>
+          <w:rPr>
+            <w:rFonts w:ascii="Cambria Math" w:eastAsiaTheme="minorEastAsia" w:hAnsi="Cambria Math"/>
+          </w:rPr>
+          <m:t>-</m:t>
+        </m:r>
+        <m:sSub>
+          <m:sSubPr>
+            <m:ctrlPr>
+              <w:rPr>
+                <w:rFonts w:ascii="Cambria Math" w:eastAsiaTheme="minorEastAsia" w:hAnsi="Cambria Math"/>
+                <w:i/>
+              </w:rPr>
+            </m:ctrlPr>
+          </m:sSubPr>
+          <m:e>
+            <m:r>
+              <w:rPr>
+                <w:rFonts w:ascii="Cambria Math" w:eastAsiaTheme="minorEastAsia" w:hAnsi="Cambria Math"/>
+              </w:rPr>
+              <m:t>s</m:t>
+            </m:r>
+          </m:e>
+          <m:sub>
+            <m:r>
+              <w:rPr>
+                <w:rFonts w:ascii="Cambria Math" w:eastAsiaTheme="minorEastAsia" w:hAnsi="Cambria Math"/>
+              </w:rPr>
+              <m:t>i,0</m:t>
+            </m:r>
+          </m:sub>
+        </m:sSub>
+      </m:oMath>
+      <w:r>
+        <w:rPr>
+          <w:rFonts w:eastAsiaTheme="minorEastAsia"/>
+        </w:rPr>
+        <w:t xml:space="preserve"> og </w:t>
+      </w:r>
+      <m:oMath>
+        <m:r>
+          <m:rPr>
+            <m:sty m:val="p"/>
+          </m:rPr>
+          <w:rPr>
+            <w:rFonts w:ascii="Cambria Math" w:eastAsiaTheme="minorEastAsia" w:hAnsi="Cambria Math"/>
+          </w:rPr>
+          <m:t>Δ</m:t>
+        </m:r>
+        <m:sSub>
+          <m:sSubPr>
+            <m:ctrlPr>
+              <w:rPr>
+                <w:rFonts w:ascii="Cambria Math" w:eastAsiaTheme="minorEastAsia" w:hAnsi="Cambria Math"/>
+                <w:i/>
+              </w:rPr>
+            </m:ctrlPr>
+          </m:sSubPr>
+          <m:e>
+            <m:r>
+              <w:rPr>
+                <w:rFonts w:ascii="Cambria Math" w:eastAsiaTheme="minorEastAsia" w:hAnsi="Cambria Math"/>
+              </w:rPr>
+              <m:t>e</m:t>
+            </m:r>
+          </m:e>
+          <m:sub>
+            <m:r>
+              <w:rPr>
+                <w:rFonts w:ascii="Cambria Math" w:eastAsiaTheme="minorEastAsia" w:hAnsi="Cambria Math"/>
+              </w:rPr>
+              <m:t>i</m:t>
+            </m:r>
+          </m:sub>
+        </m:sSub>
+        <m:r>
+          <w:rPr>
+            <w:rFonts w:ascii="Cambria Math" w:eastAsiaTheme="minorEastAsia" w:hAnsi="Cambria Math"/>
+          </w:rPr>
+          <m:t>=</m:t>
+        </m:r>
+        <m:sSub>
+          <m:sSubPr>
+            <m:ctrlPr>
+              <w:rPr>
+                <w:rFonts w:ascii="Cambria Math" w:eastAsiaTheme="minorEastAsia" w:hAnsi="Cambria Math"/>
+                <w:i/>
+              </w:rPr>
+            </m:ctrlPr>
+          </m:sSubPr>
+          <m:e>
+            <m:r>
+              <w:rPr>
+                <w:rFonts w:ascii="Cambria Math" w:eastAsiaTheme="minorEastAsia" w:hAnsi="Cambria Math"/>
+              </w:rPr>
+              <m:t>e</m:t>
+            </m:r>
+          </m:e>
+          <m:sub>
+            <m:r>
+              <w:rPr>
+                <w:rFonts w:ascii="Cambria Math" w:eastAsiaTheme="minorEastAsia" w:hAnsi="Cambria Math"/>
+              </w:rPr>
+              <m:t>i,1</m:t>
+            </m:r>
+          </m:sub>
+        </m:sSub>
+        <m:r>
+          <w:rPr>
+            <w:rFonts w:ascii="Cambria Math" w:eastAsiaTheme="minorEastAsia" w:hAnsi="Cambria Math"/>
+          </w:rPr>
+          <m:t>-</m:t>
+        </m:r>
+        <m:sSub>
+          <m:sSubPr>
+            <m:ctrlPr>
+              <w:rPr>
+                <w:rFonts w:ascii="Cambria Math" w:eastAsiaTheme="minorEastAsia" w:hAnsi="Cambria Math"/>
+                <w:i/>
+              </w:rPr>
+            </m:ctrlPr>
+          </m:sSubPr>
+          <m:e>
+            <m:r>
+              <w:rPr>
+                <w:rFonts w:ascii="Cambria Math" w:eastAsiaTheme="minorEastAsia" w:hAnsi="Cambria Math"/>
+              </w:rPr>
+              <m:t>e</m:t>
+            </m:r>
+          </m:e>
+          <m:sub>
+            <m:r>
+              <w:rPr>
+                <w:rFonts w:ascii="Cambria Math" w:eastAsiaTheme="minorEastAsia" w:hAnsi="Cambria Math"/>
+              </w:rPr>
+              <m:t>i,0</m:t>
+            </m:r>
+          </m:sub>
+        </m:sSub>
+      </m:oMath>
+      <w:r>
+        <w:rPr>
+          <w:rFonts w:eastAsiaTheme="minorEastAsia"/>
+        </w:rPr>
+        <w:t>.</w:t>
+      </w:r>
+      <w:r>
+        <w:rPr>
+          <w:rFonts w:eastAsiaTheme="minorEastAsia"/>
+        </w:rPr>
+        <w:t xml:space="preserve"> Da findes to effekter, der opgør udviklingen i </w:t>
+      </w:r>
+      <m:oMath>
+        <m:sSub>
+          <m:sSubPr>
+            <m:ctrlPr>
+              <w:rPr>
+                <w:rFonts w:ascii="Cambria Math" w:eastAsiaTheme="minorEastAsia" w:hAnsi="Cambria Math"/>
+                <w:i/>
+              </w:rPr>
+            </m:ctrlPr>
+          </m:sSubPr>
+          <m:e>
+            <m:r>
+              <w:rPr>
+                <w:rFonts w:ascii="Cambria Math" w:eastAsiaTheme="minorEastAsia" w:hAnsi="Cambria Math"/>
+              </w:rPr>
+              <m:t>E</m:t>
+            </m:r>
+          </m:e>
+          <m:sub>
+            <m:r>
+              <w:rPr>
+                <w:rFonts w:ascii="Cambria Math" w:eastAsiaTheme="minorEastAsia" w:hAnsi="Cambria Math"/>
+              </w:rPr>
+              <m:t>t</m:t>
+            </m:r>
+          </m:sub>
+        </m:sSub>
+      </m:oMath>
+      <w:r>
+        <w:rPr>
+          <w:rFonts w:eastAsiaTheme="minorEastAsia"/>
+        </w:rPr>
+        <w:t>,</w:t>
+      </w:r>
+    </w:p>
+    <w:p>
+      <w:pPr>
+        <w:jc w:val="both"/>
+        <w:rPr>
+          <w:rFonts w:eastAsiaTheme="minorEastAsia"/>
+        </w:rPr>
+      </w:pPr>
+      <m:oMathPara>
+        <m:oMath>
+          <m:eqArr>
+            <m:eqArrPr>
+              <m:maxDist m:val="1"/>
+              <m:ctrlPr>
+                <w:rPr>
+                  <w:rFonts w:ascii="Cambria Math" w:eastAsiaTheme="minorEastAsia" w:hAnsi="Cambria Math"/>
+                  <w:i/>
+                </w:rPr>
+              </m:ctrlPr>
+            </m:eqArrPr>
+            <m:e>
+              <m:r>
+                <w:rPr>
+                  <w:rFonts w:ascii="Cambria Math" w:eastAsiaTheme="minorEastAsia" w:hAnsi="Cambria Math"/>
+                </w:rPr>
+                <m:t>C=</m:t>
+              </m:r>
+              <m:nary>
+                <m:naryPr>
+                  <m:chr m:val="∑"/>
+                  <m:supHide m:val="1"/>
+                  <m:ctrlPr>
+                    <w:rPr>
+                      <w:rFonts w:ascii="Cambria Math" w:eastAsiaTheme="minorEastAsia" w:hAnsi="Cambria Math"/>
+                    </w:rPr>
+                  </m:ctrlPr>
+                </m:naryPr>
+                <m:sub>
+                  <m:r>
+                    <w:rPr>
+                      <w:rFonts w:ascii="Cambria Math" w:eastAsiaTheme="minorEastAsia" w:hAnsi="Cambria Math"/>
+                    </w:rPr>
+                    <m:t>i</m:t>
+                  </m:r>
+                  <m:ctrlPr>
+                    <w:rPr>
+                      <w:rFonts w:ascii="Cambria Math" w:eastAsiaTheme="minorEastAsia" w:hAnsi="Cambria Math"/>
+                      <w:i/>
+                    </w:rPr>
+                  </m:ctrlPr>
+                </m:sub>
+                <m:sup>
+                  <m:ctrlPr>
+                    <w:rPr>
+                      <w:rFonts w:ascii="Cambria Math" w:eastAsiaTheme="minorEastAsia" w:hAnsi="Cambria Math"/>
+                      <w:i/>
+                    </w:rPr>
+                  </m:ctrlPr>
+                </m:sup>
+                <m:e>
+                  <m:r>
+                    <m:rPr>
+                      <m:sty m:val="p"/>
+                    </m:rPr>
+                    <w:rPr>
+                      <w:rFonts w:ascii="Cambria Math" w:eastAsiaTheme="minorEastAsia" w:hAnsi="Cambria Math"/>
+                    </w:rPr>
+                    <m:t>Δ</m:t>
+                  </m:r>
+                  <m:sSub>
+                    <m:sSubPr>
+                      <m:ctrlPr>
+                        <w:rPr>
+                          <w:rFonts w:ascii="Cambria Math" w:eastAsiaTheme="minorEastAsia" w:hAnsi="Cambria Math"/>
+                          <w:i/>
+                        </w:rPr>
+                      </m:ctrlPr>
+                    </m:sSubPr>
+                    <m:e>
+                      <m:r>
+                        <w:rPr>
+                          <w:rFonts w:ascii="Cambria Math" w:eastAsiaTheme="minorEastAsia" w:hAnsi="Cambria Math"/>
+                        </w:rPr>
+                        <m:t>s</m:t>
+                      </m:r>
+                    </m:e>
+                    <m:sub>
+                      <m:r>
+                        <w:rPr>
+                          <w:rFonts w:ascii="Cambria Math" w:eastAsiaTheme="minorEastAsia" w:hAnsi="Cambria Math"/>
+                        </w:rPr>
+                        <m:t>i</m:t>
+                      </m:r>
+                    </m:sub>
+                  </m:sSub>
+                  <m:acc>
+                    <m:accPr>
+                      <m:chr m:val="̅"/>
+                      <m:ctrlPr>
+                        <w:rPr>
+                          <w:rFonts w:ascii="Cambria Math" w:eastAsiaTheme="minorEastAsia" w:hAnsi="Cambria Math"/>
+                        </w:rPr>
+                      </m:ctrlPr>
+                    </m:accPr>
+                    <m:e>
+                      <m:sSub>
+                        <m:sSubPr>
+                          <m:ctrlPr>
+                            <w:rPr>
+                              <w:rFonts w:ascii="Cambria Math" w:eastAsiaTheme="minorEastAsia" w:hAnsi="Cambria Math"/>
+                              <w:i/>
+                            </w:rPr>
+                          </m:ctrlPr>
+                        </m:sSubPr>
+                        <m:e>
+                          <m:r>
+                            <w:rPr>
+                              <w:rFonts w:ascii="Cambria Math" w:eastAsiaTheme="minorEastAsia" w:hAnsi="Cambria Math"/>
+                            </w:rPr>
+                            <m:t>e</m:t>
+                          </m:r>
+                          <m:ctrlPr>
+                            <w:rPr>
+                              <w:rFonts w:ascii="Cambria Math" w:eastAsiaTheme="minorEastAsia" w:hAnsi="Cambria Math"/>
+                            </w:rPr>
+                          </m:ctrlPr>
+                        </m:e>
+                        <m:sub>
+                          <m:r>
+                            <w:rPr>
+                              <w:rFonts w:ascii="Cambria Math" w:eastAsiaTheme="minorEastAsia" w:hAnsi="Cambria Math"/>
+                            </w:rPr>
+                            <m:t>i</m:t>
+                          </m:r>
+                        </m:sub>
+                      </m:sSub>
+                    </m:e>
+                  </m:acc>
+                  <m:ctrlPr>
+                    <w:rPr>
+                      <w:rFonts w:ascii="Cambria Math" w:eastAsiaTheme="minorEastAsia" w:hAnsi="Cambria Math"/>
+                      <w:i/>
+                    </w:rPr>
+                  </m:ctrlPr>
+                </m:e>
+              </m:nary>
+              <m:r>
+                <w:rPr>
+                  <w:rFonts w:ascii="Cambria Math" w:eastAsiaTheme="minorEastAsia" w:hAnsi="Cambria Math"/>
+                </w:rPr>
+                <m:t>#</m:t>
+              </m:r>
+              <m:d>
+                <m:dPr>
+                  <m:ctrlPr>
+                    <w:rPr>
+                      <w:rFonts w:ascii="Cambria Math" w:eastAsiaTheme="minorEastAsia" w:hAnsi="Cambria Math"/>
+                      <w:i/>
+                    </w:rPr>
+                  </m:ctrlPr>
+                </m:dPr>
+                <m:e>
+                  <m:r>
+                    <m:rPr>
+                      <m:nor/>
+                    </m:rPr>
+                    <w:rPr>
+                      <w:rFonts w:ascii="Cambria Math" w:eastAsiaTheme="minorEastAsia" w:hAnsi="Cambria Math"/>
+                    </w:rPr>
+                    <m:t>sammensætning</m:t>
+                  </m:r>
+                </m:e>
+              </m:d>
+            </m:e>
+          </m:eqArr>
+        </m:oMath>
+      </m:oMathPara>
+    </w:p>
+    <w:p>
+      <w:pPr>
+        <w:jc w:val="both"/>
+        <w:rPr>
+          <w:rFonts w:eastAsiaTheme="minorEastAsia"/>
+          <w:lang w:val="sv-SE"/>
+        </w:rPr>
+      </w:pPr>
+      <m:oMathPara>
+        <m:oMath>
+          <m:eqArr>
+            <m:eqArrPr>
+              <m:maxDist m:val="1"/>
+              <m:ctrlPr>
+                <w:rPr>
+                  <w:rFonts w:ascii="Cambria Math" w:eastAsiaTheme="minorEastAsia" w:hAnsi="Cambria Math"/>
+                  <w:i/>
+                </w:rPr>
+              </m:ctrlPr>
+            </m:eqArrPr>
+            <m:e>
+              <m:r>
+                <w:rPr>
+                  <w:rFonts w:ascii="Cambria Math" w:eastAsiaTheme="minorEastAsia" w:hAnsi="Cambria Math"/>
+                </w:rPr>
+                <m:t>I</m:t>
+              </m:r>
+              <m:r>
+                <w:rPr>
+                  <w:rFonts w:ascii="Cambria Math" w:eastAsiaTheme="minorEastAsia" w:hAnsi="Cambria Math"/>
+                  <w:lang w:val="sv-SE"/>
+                </w:rPr>
+                <m:t>=</m:t>
+              </m:r>
+              <m:nary>
+                <m:naryPr>
+                  <m:chr m:val="∑"/>
+                  <m:supHide m:val="1"/>
+                  <m:ctrlPr>
+                    <w:rPr>
+                      <w:rFonts w:ascii="Cambria Math" w:eastAsiaTheme="minorEastAsia" w:hAnsi="Cambria Math"/>
+                    </w:rPr>
+                  </m:ctrlPr>
+                </m:naryPr>
+                <m:sub>
+                  <m:r>
+                    <w:rPr>
+                      <w:rFonts w:ascii="Cambria Math" w:eastAsiaTheme="minorEastAsia" w:hAnsi="Cambria Math"/>
+                    </w:rPr>
+                    <m:t>i</m:t>
+                  </m:r>
+                  <m:ctrlPr>
+                    <w:rPr>
+                      <w:rFonts w:ascii="Cambria Math" w:eastAsiaTheme="minorEastAsia" w:hAnsi="Cambria Math"/>
+                      <w:i/>
+                    </w:rPr>
+                  </m:ctrlPr>
+                </m:sub>
+                <m:sup>
+                  <m:ctrlPr>
+                    <w:rPr>
+                      <w:rFonts w:ascii="Cambria Math" w:eastAsiaTheme="minorEastAsia" w:hAnsi="Cambria Math"/>
+                      <w:i/>
+                    </w:rPr>
+                  </m:ctrlPr>
+                </m:sup>
+                <m:e>
+                  <m:acc>
+                    <m:accPr>
+                      <m:chr m:val="̅"/>
+                      <m:ctrlPr>
+                        <w:rPr>
+                          <w:rFonts w:ascii="Cambria Math" w:eastAsiaTheme="minorEastAsia" w:hAnsi="Cambria Math"/>
+                        </w:rPr>
+                      </m:ctrlPr>
+                    </m:accPr>
+                    <m:e>
+                      <m:sSub>
+                        <m:sSubPr>
+                          <m:ctrlPr>
+                            <w:rPr>
+                              <w:rFonts w:ascii="Cambria Math" w:eastAsiaTheme="minorEastAsia" w:hAnsi="Cambria Math"/>
+                              <w:i/>
+                            </w:rPr>
+                          </m:ctrlPr>
+                        </m:sSubPr>
+                        <m:e>
+                          <m:r>
+                            <w:rPr>
+                              <w:rFonts w:ascii="Cambria Math" w:eastAsiaTheme="minorEastAsia" w:hAnsi="Cambria Math"/>
+                            </w:rPr>
+                            <m:t>s</m:t>
+                          </m:r>
+                          <m:ctrlPr>
+                            <w:rPr>
+                              <w:rFonts w:ascii="Cambria Math" w:eastAsiaTheme="minorEastAsia" w:hAnsi="Cambria Math"/>
+                            </w:rPr>
+                          </m:ctrlPr>
+                        </m:e>
+                        <m:sub>
+                          <m:r>
+                            <w:rPr>
+                              <w:rFonts w:ascii="Cambria Math" w:eastAsiaTheme="minorEastAsia" w:hAnsi="Cambria Math"/>
+                            </w:rPr>
+                            <m:t>i</m:t>
+                          </m:r>
+                        </m:sub>
+                      </m:sSub>
+                    </m:e>
+                  </m:acc>
+                  <m:r>
+                    <m:rPr>
+                      <m:sty m:val="p"/>
+                    </m:rPr>
+                    <w:rPr>
+                      <w:rFonts w:ascii="Cambria Math" w:eastAsiaTheme="minorEastAsia" w:hAnsi="Cambria Math"/>
+                    </w:rPr>
+                    <m:t>Δ</m:t>
+                  </m:r>
+                  <m:sSub>
+                    <m:sSubPr>
+                      <m:ctrlPr>
+                        <w:rPr>
+                          <w:rFonts w:ascii="Cambria Math" w:eastAsiaTheme="minorEastAsia" w:hAnsi="Cambria Math"/>
+                          <w:i/>
+                        </w:rPr>
+                      </m:ctrlPr>
+                    </m:sSubPr>
+                    <m:e>
+                      <m:r>
+                        <w:rPr>
+                          <w:rFonts w:ascii="Cambria Math" w:eastAsiaTheme="minorEastAsia" w:hAnsi="Cambria Math"/>
+                        </w:rPr>
+                        <m:t>e</m:t>
+                      </m:r>
+                    </m:e>
+                    <m:sub>
+                      <m:r>
+                        <w:rPr>
+                          <w:rFonts w:ascii="Cambria Math" w:eastAsiaTheme="minorEastAsia" w:hAnsi="Cambria Math"/>
+                        </w:rPr>
+                        <m:t>i</m:t>
+                      </m:r>
+                    </m:sub>
+                  </m:sSub>
+                  <m:ctrlPr>
+                    <w:rPr>
+                      <w:rFonts w:ascii="Cambria Math" w:eastAsiaTheme="minorEastAsia" w:hAnsi="Cambria Math"/>
+                      <w:i/>
+                    </w:rPr>
+                  </m:ctrlPr>
+                </m:e>
+              </m:nary>
+              <m:r>
+                <w:rPr>
+                  <w:rFonts w:ascii="Cambria Math" w:eastAsiaTheme="minorEastAsia" w:hAnsi="Cambria Math"/>
+                  <w:lang w:val="sv-SE"/>
+                </w:rPr>
+                <m:t>#</m:t>
+              </m:r>
+              <m:d>
+                <m:dPr>
+                  <m:ctrlPr>
+                    <w:rPr>
+                      <w:rFonts w:ascii="Cambria Math" w:eastAsiaTheme="minorEastAsia" w:hAnsi="Cambria Math"/>
+                      <w:i/>
+                    </w:rPr>
+                  </m:ctrlPr>
+                </m:dPr>
+                <m:e>
+                  <m:r>
+                    <m:rPr>
+                      <m:nor/>
+                    </m:rPr>
+                    <w:rPr>
+                      <w:rFonts w:ascii="Cambria Math" w:eastAsiaTheme="minorEastAsia" w:hAnsi="Cambria Math"/>
+                      <w:lang w:val="sv-SE"/>
+                    </w:rPr>
+                    <m:t>intensitet</m:t>
+                  </m:r>
+                </m:e>
+              </m:d>
+            </m:e>
+          </m:eqArr>
+        </m:oMath>
+      </m:oMathPara>
+    </w:p>
+    <w:p>
+      <w:pPr>
+        <w:jc w:val="both"/>
+        <w:rPr>
+          <w:rFonts w:eastAsiaTheme="minorEastAsia"/>
+        </w:rPr>
+      </w:pPr>
+      <w:r>
+        <w:rPr>
+          <w:rFonts w:eastAsiaTheme="minorEastAsia"/>
+          <w:b/>
+          <w:bCs/>
+        </w:rPr>
+        <w:t xml:space="preserve">Påstand: </w:t>
+      </w:r>
+      <m:oMath>
+        <m:r>
+          <m:rPr>
+            <m:sty m:val="p"/>
+          </m:rPr>
+          <w:rPr>
+            <w:rFonts w:ascii="Cambria Math" w:eastAsiaTheme="minorEastAsia" w:hAnsi="Cambria Math"/>
+          </w:rPr>
+          <m:t>Δ</m:t>
+        </m:r>
+        <m:r>
+          <w:rPr>
+            <w:rFonts w:ascii="Cambria Math" w:eastAsiaTheme="minorEastAsia" w:hAnsi="Cambria Math"/>
+          </w:rPr>
+          <m:t>E</m:t>
+        </m:r>
+        <m:r>
+          <w:rPr>
+            <w:rFonts w:ascii="Cambria Math" w:eastAsiaTheme="minorEastAsia" w:hAnsi="Cambria Math"/>
+          </w:rPr>
+          <m:t>=</m:t>
+        </m:r>
+        <m:sSub>
+          <m:sSubPr>
+            <m:ctrlPr>
+              <w:rPr>
+                <w:rFonts w:ascii="Cambria Math" w:eastAsiaTheme="minorEastAsia" w:hAnsi="Cambria Math"/>
+                <w:i/>
+              </w:rPr>
+            </m:ctrlPr>
+          </m:sSubPr>
+          <m:e>
+            <m:r>
+              <w:rPr>
+                <w:rFonts w:ascii="Cambria Math" w:eastAsiaTheme="minorEastAsia" w:hAnsi="Cambria Math"/>
+              </w:rPr>
+              <m:t>E</m:t>
+            </m:r>
+          </m:e>
+          <m:sub>
+            <m:r>
+              <w:rPr>
+                <w:rFonts w:ascii="Cambria Math" w:eastAsiaTheme="minorEastAsia" w:hAnsi="Cambria Math"/>
+              </w:rPr>
+              <m:t>1</m:t>
+            </m:r>
+          </m:sub>
+        </m:sSub>
+        <m:r>
+          <w:rPr>
+            <w:rFonts w:ascii="Cambria Math" w:eastAsiaTheme="minorEastAsia" w:hAnsi="Cambria Math"/>
+          </w:rPr>
+          <m:t>-</m:t>
+        </m:r>
+        <m:sSub>
+          <m:sSubPr>
+            <m:ctrlPr>
+              <w:rPr>
+                <w:rFonts w:ascii="Cambria Math" w:eastAsiaTheme="minorEastAsia" w:hAnsi="Cambria Math"/>
+                <w:i/>
+              </w:rPr>
+            </m:ctrlPr>
+          </m:sSubPr>
+          <m:e>
+            <m:r>
+              <w:rPr>
+                <w:rFonts w:ascii="Cambria Math" w:eastAsiaTheme="minorEastAsia" w:hAnsi="Cambria Math"/>
+              </w:rPr>
+              <m:t>E</m:t>
+            </m:r>
+          </m:e>
+          <m:sub>
+            <m:r>
+              <w:rPr>
+                <w:rFonts w:ascii="Cambria Math" w:eastAsiaTheme="minorEastAsia" w:hAnsi="Cambria Math"/>
+              </w:rPr>
+              <m:t>0</m:t>
+            </m:r>
+          </m:sub>
+        </m:sSub>
+        <m:r>
+          <w:rPr>
+            <w:rFonts w:ascii="Cambria Math" w:eastAsiaTheme="minorEastAsia" w:hAnsi="Cambria Math"/>
+          </w:rPr>
+          <m:t>=C+I</m:t>
+        </m:r>
+      </m:oMath>
+      <w:r>
+        <w:rPr>
+          <w:rFonts w:eastAsiaTheme="minorEastAsia"/>
+        </w:rPr>
+        <w:t>.</w:t>
+      </w:r>
+    </w:p>
+    <w:p>
+      <w:pPr>
+        <w:jc w:val="both"/>
+        <w:rPr>
+          <w:rFonts w:eastAsiaTheme="minorEastAsia"/>
+        </w:rPr>
+      </w:pPr>
+      <w:r>
+        <w:rPr>
+          <w:rFonts w:eastAsiaTheme="minorEastAsia"/>
+          <w:b/>
+          <w:bCs/>
+        </w:rPr>
+        <w:t>Bevis:</w:t>
+      </w:r>
+      <w:r>
+        <w:rPr>
+          <w:rFonts w:eastAsiaTheme="minorEastAsia"/>
+        </w:rPr>
+        <w:t xml:space="preserve"> </w:t>
+      </w:r>
+      <w:r>
+        <w:rPr>
+          <w:rFonts w:eastAsiaTheme="minorEastAsia"/>
+        </w:rPr>
+        <w:t xml:space="preserve">Jeg beregner </w:t>
+      </w:r>
+      <m:oMath>
+        <m:r>
+          <w:rPr>
+            <w:rFonts w:ascii="Cambria Math" w:eastAsiaTheme="minorEastAsia" w:hAnsi="Cambria Math"/>
+          </w:rPr>
+          <m:t>C+I</m:t>
+        </m:r>
+      </m:oMath>
+      <w:r>
+        <w:rPr>
+          <w:rFonts w:eastAsiaTheme="minorEastAsia"/>
+        </w:rPr>
+        <w:t xml:space="preserve"> ud fra definitionerne:</w:t>
+      </w:r>
+    </w:p>
+    <w:p>
+      <w:pPr>
+        <w:jc w:val="both"/>
+        <w:rPr>
+          <w:rFonts w:eastAsiaTheme="minorEastAsia"/>
+        </w:rPr>
+      </w:pPr>
+      <m:oMathPara>
+        <m:oMath>
+          <m:r>
+            <w:rPr>
+              <w:rFonts w:ascii="Cambria Math" w:eastAsiaTheme="minorEastAsia" w:hAnsi="Cambria Math"/>
+            </w:rPr>
+            <m:t>C+I=</m:t>
+          </m:r>
+          <m:nary>
+            <m:naryPr>
+              <m:chr m:val="∑"/>
+              <m:supHide m:val="1"/>
+              <m:ctrlPr>
+                <w:rPr>
+                  <w:rFonts w:ascii="Cambria Math" w:eastAsiaTheme="minorEastAsia" w:hAnsi="Cambria Math"/>
+                </w:rPr>
+              </m:ctrlPr>
+            </m:naryPr>
+            <m:sub>
+              <m:r>
+                <w:rPr>
+                  <w:rFonts w:ascii="Cambria Math" w:eastAsiaTheme="minorEastAsia" w:hAnsi="Cambria Math"/>
+                </w:rPr>
+                <m:t>i</m:t>
+              </m:r>
+              <m:ctrlPr>
+                <w:rPr>
+                  <w:rFonts w:ascii="Cambria Math" w:eastAsiaTheme="minorEastAsia" w:hAnsi="Cambria Math"/>
+                  <w:i/>
+                </w:rPr>
+              </m:ctrlPr>
+            </m:sub>
+            <m:sup>
+              <m:ctrlPr>
+                <w:rPr>
+                  <w:rFonts w:ascii="Cambria Math" w:eastAsiaTheme="minorEastAsia" w:hAnsi="Cambria Math"/>
+                  <w:i/>
+                </w:rPr>
+              </m:ctrlPr>
+            </m:sup>
+            <m:e>
+              <m:r>
+                <m:rPr>
+                  <m:sty m:val="p"/>
+                </m:rPr>
+                <w:rPr>
+                  <w:rFonts w:ascii="Cambria Math" w:eastAsiaTheme="minorEastAsia" w:hAnsi="Cambria Math"/>
+                </w:rPr>
+                <m:t>Δ</m:t>
+              </m:r>
+              <m:sSub>
+                <m:sSubPr>
+                  <m:ctrlPr>
+                    <w:rPr>
+                      <w:rFonts w:ascii="Cambria Math" w:eastAsiaTheme="minorEastAsia" w:hAnsi="Cambria Math"/>
+                      <w:i/>
+                    </w:rPr>
+                  </m:ctrlPr>
+                </m:sSubPr>
+                <m:e>
+                  <m:r>
+                    <w:rPr>
+                      <w:rFonts w:ascii="Cambria Math" w:eastAsiaTheme="minorEastAsia" w:hAnsi="Cambria Math"/>
+                    </w:rPr>
+                    <m:t>s</m:t>
+                  </m:r>
+                </m:e>
+                <m:sub>
+                  <m:r>
+                    <w:rPr>
+                      <w:rFonts w:ascii="Cambria Math" w:eastAsiaTheme="minorEastAsia" w:hAnsi="Cambria Math"/>
+                    </w:rPr>
+                    <m:t>i</m:t>
+                  </m:r>
+                </m:sub>
+              </m:sSub>
+              <m:acc>
+                <m:accPr>
+                  <m:chr m:val="̅"/>
+                  <m:ctrlPr>
+                    <w:rPr>
+                      <w:rFonts w:ascii="Cambria Math" w:eastAsiaTheme="minorEastAsia" w:hAnsi="Cambria Math"/>
+                    </w:rPr>
+                  </m:ctrlPr>
+                </m:accPr>
+                <m:e>
+                  <m:sSub>
+                    <m:sSubPr>
+                      <m:ctrlPr>
+                        <w:rPr>
+                          <w:rFonts w:ascii="Cambria Math" w:eastAsiaTheme="minorEastAsia" w:hAnsi="Cambria Math"/>
+                          <w:i/>
+                        </w:rPr>
+                      </m:ctrlPr>
+                    </m:sSubPr>
+                    <m:e>
+                      <m:r>
+                        <w:rPr>
+                          <w:rFonts w:ascii="Cambria Math" w:eastAsiaTheme="minorEastAsia" w:hAnsi="Cambria Math"/>
+                        </w:rPr>
+                        <m:t>e</m:t>
+                      </m:r>
+                      <m:ctrlPr>
+                        <w:rPr>
+                          <w:rFonts w:ascii="Cambria Math" w:eastAsiaTheme="minorEastAsia" w:hAnsi="Cambria Math"/>
+                        </w:rPr>
+                      </m:ctrlPr>
+                    </m:e>
+                    <m:sub>
+                      <m:r>
+                        <w:rPr>
+                          <w:rFonts w:ascii="Cambria Math" w:eastAsiaTheme="minorEastAsia" w:hAnsi="Cambria Math"/>
+                        </w:rPr>
+                        <m:t>i</m:t>
+                      </m:r>
+                    </m:sub>
+                  </m:sSub>
+                </m:e>
+              </m:acc>
+              <m:ctrlPr>
+                <w:rPr>
+                  <w:rFonts w:ascii="Cambria Math" w:eastAsiaTheme="minorEastAsia" w:hAnsi="Cambria Math"/>
+                  <w:i/>
+                </w:rPr>
+              </m:ctrlPr>
+            </m:e>
+          </m:nary>
+          <m:r>
+            <w:rPr>
+              <w:rFonts w:ascii="Cambria Math" w:eastAsiaTheme="minorEastAsia" w:hAnsi="Cambria Math"/>
+            </w:rPr>
+            <m:t>+</m:t>
+          </m:r>
+          <m:nary>
+            <m:naryPr>
+              <m:chr m:val="∑"/>
+              <m:supHide m:val="1"/>
+              <m:ctrlPr>
+                <w:rPr>
+                  <w:rFonts w:ascii="Cambria Math" w:eastAsiaTheme="minorEastAsia" w:hAnsi="Cambria Math"/>
+                </w:rPr>
+              </m:ctrlPr>
+            </m:naryPr>
+            <m:sub>
+              <m:r>
+                <w:rPr>
+                  <w:rFonts w:ascii="Cambria Math" w:eastAsiaTheme="minorEastAsia" w:hAnsi="Cambria Math"/>
+                </w:rPr>
+                <m:t>i</m:t>
+              </m:r>
+              <m:ctrlPr>
+                <w:rPr>
+                  <w:rFonts w:ascii="Cambria Math" w:eastAsiaTheme="minorEastAsia" w:hAnsi="Cambria Math"/>
+                  <w:i/>
+                </w:rPr>
+              </m:ctrlPr>
+            </m:sub>
+            <m:sup>
+              <m:ctrlPr>
+                <w:rPr>
+                  <w:rFonts w:ascii="Cambria Math" w:eastAsiaTheme="minorEastAsia" w:hAnsi="Cambria Math"/>
+                  <w:i/>
+                </w:rPr>
+              </m:ctrlPr>
+            </m:sup>
+            <m:e>
+              <m:acc>
+                <m:accPr>
+                  <m:chr m:val="̅"/>
+                  <m:ctrlPr>
+                    <w:rPr>
+                      <w:rFonts w:ascii="Cambria Math" w:eastAsiaTheme="minorEastAsia" w:hAnsi="Cambria Math"/>
+                    </w:rPr>
+                  </m:ctrlPr>
+                </m:accPr>
+                <m:e>
+                  <m:sSub>
+                    <m:sSubPr>
+                      <m:ctrlPr>
+                        <w:rPr>
+                          <w:rFonts w:ascii="Cambria Math" w:eastAsiaTheme="minorEastAsia" w:hAnsi="Cambria Math"/>
+                          <w:i/>
+                        </w:rPr>
+                      </m:ctrlPr>
+                    </m:sSubPr>
+                    <m:e>
+                      <m:r>
+                        <w:rPr>
+                          <w:rFonts w:ascii="Cambria Math" w:eastAsiaTheme="minorEastAsia" w:hAnsi="Cambria Math"/>
+                        </w:rPr>
+                        <m:t>s</m:t>
+                      </m:r>
+                      <m:ctrlPr>
+                        <w:rPr>
+                          <w:rFonts w:ascii="Cambria Math" w:eastAsiaTheme="minorEastAsia" w:hAnsi="Cambria Math"/>
+                        </w:rPr>
+                      </m:ctrlPr>
+                    </m:e>
+                    <m:sub>
+                      <m:r>
+                        <w:rPr>
+                          <w:rFonts w:ascii="Cambria Math" w:eastAsiaTheme="minorEastAsia" w:hAnsi="Cambria Math"/>
+                        </w:rPr>
+                        <m:t>i</m:t>
+                      </m:r>
+                    </m:sub>
+                  </m:sSub>
+                </m:e>
+              </m:acc>
+              <m:r>
+                <m:rPr>
+                  <m:sty m:val="p"/>
+                </m:rPr>
+                <w:rPr>
+                  <w:rFonts w:ascii="Cambria Math" w:eastAsiaTheme="minorEastAsia" w:hAnsi="Cambria Math"/>
+                </w:rPr>
+                <m:t>Δ</m:t>
+              </m:r>
+              <m:sSub>
+                <m:sSubPr>
+                  <m:ctrlPr>
+                    <w:rPr>
+                      <w:rFonts w:ascii="Cambria Math" w:eastAsiaTheme="minorEastAsia" w:hAnsi="Cambria Math"/>
+                      <w:i/>
+                    </w:rPr>
+                  </m:ctrlPr>
+                </m:sSubPr>
+                <m:e>
+                  <m:r>
+                    <w:rPr>
+                      <w:rFonts w:ascii="Cambria Math" w:eastAsiaTheme="minorEastAsia" w:hAnsi="Cambria Math"/>
+                    </w:rPr>
+                    <m:t>e</m:t>
+                  </m:r>
+                </m:e>
+                <m:sub>
+                  <m:r>
+                    <w:rPr>
+                      <w:rFonts w:ascii="Cambria Math" w:eastAsiaTheme="minorEastAsia" w:hAnsi="Cambria Math"/>
+                    </w:rPr>
+                    <m:t>i</m:t>
+                  </m:r>
+                </m:sub>
+              </m:sSub>
+              <m:ctrlPr>
+                <w:rPr>
+                  <w:rFonts w:ascii="Cambria Math" w:eastAsiaTheme="minorEastAsia" w:hAnsi="Cambria Math"/>
+                  <w:i/>
+                </w:rPr>
+              </m:ctrlPr>
+            </m:e>
+          </m:nary>
+          <m:r>
+            <w:rPr>
+              <w:rFonts w:ascii="Cambria Math" w:eastAsiaTheme="minorEastAsia" w:hAnsi="Cambria Math"/>
+            </w:rPr>
+            <m:t>=</m:t>
+          </m:r>
+          <m:f>
+            <m:fPr>
+              <m:ctrlPr>
+                <w:rPr>
+                  <w:rFonts w:ascii="Cambria Math" w:eastAsiaTheme="minorEastAsia" w:hAnsi="Cambria Math"/>
+                </w:rPr>
+              </m:ctrlPr>
+            </m:fPr>
+            <m:num>
+              <m:r>
+                <w:rPr>
+                  <w:rFonts w:ascii="Cambria Math" w:eastAsiaTheme="minorEastAsia" w:hAnsi="Cambria Math"/>
+                </w:rPr>
+                <m:t>1</m:t>
+              </m:r>
+              <m:ctrlPr>
+                <w:rPr>
+                  <w:rFonts w:ascii="Cambria Math" w:eastAsiaTheme="minorEastAsia" w:hAnsi="Cambria Math"/>
+                  <w:i/>
+                </w:rPr>
+              </m:ctrlPr>
+            </m:num>
+            <m:den>
+              <m:r>
+                <w:rPr>
+                  <w:rFonts w:ascii="Cambria Math" w:eastAsiaTheme="minorEastAsia" w:hAnsi="Cambria Math"/>
+                </w:rPr>
+                <m:t>2</m:t>
+              </m:r>
+              <m:ctrlPr>
+                <w:rPr>
+                  <w:rFonts w:ascii="Cambria Math" w:eastAsiaTheme="minorEastAsia" w:hAnsi="Cambria Math"/>
+                  <w:i/>
+                </w:rPr>
+              </m:ctrlPr>
+            </m:den>
+          </m:f>
+          <m:nary>
+            <m:naryPr>
+              <m:chr m:val="∑"/>
+              <m:supHide m:val="1"/>
+              <m:ctrlPr>
+                <w:rPr>
+                  <w:rFonts w:ascii="Cambria Math" w:eastAsiaTheme="minorEastAsia" w:hAnsi="Cambria Math"/>
+                </w:rPr>
+              </m:ctrlPr>
+            </m:naryPr>
+            <m:sub>
+              <m:r>
+                <w:rPr>
+                  <w:rFonts w:ascii="Cambria Math" w:eastAsiaTheme="minorEastAsia" w:hAnsi="Cambria Math"/>
+                </w:rPr>
+                <m:t>i</m:t>
+              </m:r>
+              <m:ctrlPr>
+                <w:rPr>
+                  <w:rFonts w:ascii="Cambria Math" w:eastAsiaTheme="minorEastAsia" w:hAnsi="Cambria Math"/>
+                  <w:i/>
+                </w:rPr>
+              </m:ctrlPr>
+            </m:sub>
+            <m:sup>
+              <m:ctrlPr>
+                <w:rPr>
+                  <w:rFonts w:ascii="Cambria Math" w:eastAsiaTheme="minorEastAsia" w:hAnsi="Cambria Math"/>
+                  <w:i/>
+                </w:rPr>
+              </m:ctrlPr>
+            </m:sup>
+            <m:e>
+              <m:d>
+                <m:dPr>
+                  <m:begChr m:val="["/>
+                  <m:endChr m:val="]"/>
+                  <m:ctrlPr>
+                    <w:rPr>
+                      <w:rFonts w:ascii="Cambria Math" w:eastAsiaTheme="minorEastAsia" w:hAnsi="Cambria Math"/>
+                      <w:i/>
+                    </w:rPr>
+                  </m:ctrlPr>
+                </m:dPr>
+                <m:e>
+                  <m:d>
+                    <m:dPr>
+                      <m:ctrlPr>
+                        <w:rPr>
+                          <w:rFonts w:ascii="Cambria Math" w:eastAsiaTheme="minorEastAsia" w:hAnsi="Cambria Math"/>
+                          <w:i/>
+                        </w:rPr>
+                      </m:ctrlPr>
+                    </m:dPr>
+                    <m:e>
+                      <m:sSub>
+                        <m:sSubPr>
+                          <m:ctrlPr>
+                            <w:rPr>
+                              <w:rFonts w:ascii="Cambria Math" w:eastAsiaTheme="minorEastAsia" w:hAnsi="Cambria Math"/>
+                              <w:i/>
+                            </w:rPr>
+                          </m:ctrlPr>
+                        </m:sSubPr>
+                        <m:e>
+                          <m:r>
+                            <w:rPr>
+                              <w:rFonts w:ascii="Cambria Math" w:eastAsiaTheme="minorEastAsia" w:hAnsi="Cambria Math"/>
+                            </w:rPr>
+                            <m:t>s</m:t>
+                          </m:r>
+                        </m:e>
+                        <m:sub>
+                          <m:r>
+                            <w:rPr>
+                              <w:rFonts w:ascii="Cambria Math" w:eastAsiaTheme="minorEastAsia" w:hAnsi="Cambria Math"/>
+                            </w:rPr>
+                            <m:t>i,1</m:t>
+                          </m:r>
+                        </m:sub>
+                      </m:sSub>
+                      <m:r>
+                        <w:rPr>
+                          <w:rFonts w:ascii="Cambria Math" w:eastAsiaTheme="minorEastAsia" w:hAnsi="Cambria Math"/>
+                        </w:rPr>
+                        <m:t>-</m:t>
+                      </m:r>
+                      <m:sSub>
+                        <m:sSubPr>
+                          <m:ctrlPr>
+                            <w:rPr>
+                              <w:rFonts w:ascii="Cambria Math" w:eastAsiaTheme="minorEastAsia" w:hAnsi="Cambria Math"/>
+                              <w:i/>
+                            </w:rPr>
+                          </m:ctrlPr>
+                        </m:sSubPr>
+                        <m:e>
+                          <m:r>
+                            <w:rPr>
+                              <w:rFonts w:ascii="Cambria Math" w:eastAsiaTheme="minorEastAsia" w:hAnsi="Cambria Math"/>
+                            </w:rPr>
+                            <m:t>s</m:t>
+                          </m:r>
+                        </m:e>
+                        <m:sub>
+                          <m:r>
+                            <w:rPr>
+                              <w:rFonts w:ascii="Cambria Math" w:eastAsiaTheme="minorEastAsia" w:hAnsi="Cambria Math"/>
+                            </w:rPr>
+                            <m:t>i,0</m:t>
+                          </m:r>
+                        </m:sub>
+                      </m:sSub>
+                    </m:e>
+                  </m:d>
+                  <m:d>
+                    <m:dPr>
+                      <m:ctrlPr>
+                        <w:rPr>
+                          <w:rFonts w:ascii="Cambria Math" w:eastAsiaTheme="minorEastAsia" w:hAnsi="Cambria Math"/>
+                          <w:i/>
+                        </w:rPr>
+                      </m:ctrlPr>
+                    </m:dPr>
+                    <m:e>
+                      <m:sSub>
+                        <m:sSubPr>
+                          <m:ctrlPr>
+                            <w:rPr>
+                              <w:rFonts w:ascii="Cambria Math" w:eastAsiaTheme="minorEastAsia" w:hAnsi="Cambria Math"/>
+                              <w:i/>
+                            </w:rPr>
+                          </m:ctrlPr>
+                        </m:sSubPr>
+                        <m:e>
+                          <m:r>
+                            <w:rPr>
+                              <w:rFonts w:ascii="Cambria Math" w:eastAsiaTheme="minorEastAsia" w:hAnsi="Cambria Math"/>
+                            </w:rPr>
+                            <m:t>e</m:t>
+                          </m:r>
+                        </m:e>
+                        <m:sub>
+                          <m:r>
+                            <w:rPr>
+                              <w:rFonts w:ascii="Cambria Math" w:eastAsiaTheme="minorEastAsia" w:hAnsi="Cambria Math"/>
+                            </w:rPr>
+                            <m:t>i,0</m:t>
+                          </m:r>
+                        </m:sub>
+                      </m:sSub>
+                      <m:r>
+                        <w:rPr>
+                          <w:rFonts w:ascii="Cambria Math" w:eastAsiaTheme="minorEastAsia" w:hAnsi="Cambria Math"/>
+                        </w:rPr>
+                        <m:t>+</m:t>
+                      </m:r>
+                      <m:sSub>
+                        <m:sSubPr>
+                          <m:ctrlPr>
+                            <w:rPr>
+                              <w:rFonts w:ascii="Cambria Math" w:eastAsiaTheme="minorEastAsia" w:hAnsi="Cambria Math"/>
+                              <w:i/>
+                            </w:rPr>
+                          </m:ctrlPr>
+                        </m:sSubPr>
+                        <m:e>
+                          <m:r>
+                            <w:rPr>
+                              <w:rFonts w:ascii="Cambria Math" w:eastAsiaTheme="minorEastAsia" w:hAnsi="Cambria Math"/>
+                            </w:rPr>
+                            <m:t>e</m:t>
+                          </m:r>
+                        </m:e>
+                        <m:sub>
+                          <m:r>
+                            <w:rPr>
+                              <w:rFonts w:ascii="Cambria Math" w:eastAsiaTheme="minorEastAsia" w:hAnsi="Cambria Math"/>
+                            </w:rPr>
+                            <m:t>i,1</m:t>
+                          </m:r>
+                        </m:sub>
+                      </m:sSub>
+                    </m:e>
+                  </m:d>
+                  <m:r>
+                    <w:rPr>
+                      <w:rFonts w:ascii="Cambria Math" w:eastAsiaTheme="minorEastAsia" w:hAnsi="Cambria Math"/>
+                    </w:rPr>
+                    <m:t>+</m:t>
+                  </m:r>
+                  <m:d>
+                    <m:dPr>
+                      <m:ctrlPr>
+                        <w:rPr>
+                          <w:rFonts w:ascii="Cambria Math" w:eastAsiaTheme="minorEastAsia" w:hAnsi="Cambria Math"/>
+                          <w:i/>
+                        </w:rPr>
+                      </m:ctrlPr>
+                    </m:dPr>
+                    <m:e>
+                      <m:sSub>
+                        <m:sSubPr>
+                          <m:ctrlPr>
+                            <w:rPr>
+                              <w:rFonts w:ascii="Cambria Math" w:eastAsiaTheme="minorEastAsia" w:hAnsi="Cambria Math"/>
+                              <w:i/>
+                            </w:rPr>
+                          </m:ctrlPr>
+                        </m:sSubPr>
+                        <m:e>
+                          <m:r>
+                            <w:rPr>
+                              <w:rFonts w:ascii="Cambria Math" w:eastAsiaTheme="minorEastAsia" w:hAnsi="Cambria Math"/>
+                            </w:rPr>
+                            <m:t>s</m:t>
+                          </m:r>
+                        </m:e>
+                        <m:sub>
+                          <m:r>
+                            <w:rPr>
+                              <w:rFonts w:ascii="Cambria Math" w:eastAsiaTheme="minorEastAsia" w:hAnsi="Cambria Math"/>
+                            </w:rPr>
+                            <m:t>i,0</m:t>
+                          </m:r>
+                        </m:sub>
+                      </m:sSub>
+                      <m:r>
+                        <w:rPr>
+                          <w:rFonts w:ascii="Cambria Math" w:eastAsiaTheme="minorEastAsia" w:hAnsi="Cambria Math"/>
+                        </w:rPr>
+                        <m:t>+</m:t>
+                      </m:r>
+                      <m:sSub>
+                        <m:sSubPr>
+                          <m:ctrlPr>
+                            <w:rPr>
+                              <w:rFonts w:ascii="Cambria Math" w:eastAsiaTheme="minorEastAsia" w:hAnsi="Cambria Math"/>
+                              <w:i/>
+                            </w:rPr>
+                          </m:ctrlPr>
+                        </m:sSubPr>
+                        <m:e>
+                          <m:r>
+                            <w:rPr>
+                              <w:rFonts w:ascii="Cambria Math" w:eastAsiaTheme="minorEastAsia" w:hAnsi="Cambria Math"/>
+                            </w:rPr>
+                            <m:t>s</m:t>
+                          </m:r>
+                        </m:e>
+                        <m:sub>
+                          <m:r>
+                            <w:rPr>
+                              <w:rFonts w:ascii="Cambria Math" w:eastAsiaTheme="minorEastAsia" w:hAnsi="Cambria Math"/>
+                            </w:rPr>
+                            <m:t>i,1</m:t>
+                          </m:r>
+                        </m:sub>
+                      </m:sSub>
+                    </m:e>
+                  </m:d>
+                  <m:d>
+                    <m:dPr>
+                      <m:ctrlPr>
+                        <w:rPr>
+                          <w:rFonts w:ascii="Cambria Math" w:eastAsiaTheme="minorEastAsia" w:hAnsi="Cambria Math"/>
+                          <w:i/>
+                        </w:rPr>
+                      </m:ctrlPr>
+                    </m:dPr>
+                    <m:e>
+                      <m:sSub>
+                        <m:sSubPr>
+                          <m:ctrlPr>
+                            <w:rPr>
+                              <w:rFonts w:ascii="Cambria Math" w:eastAsiaTheme="minorEastAsia" w:hAnsi="Cambria Math"/>
+                              <w:i/>
+                            </w:rPr>
+                          </m:ctrlPr>
+                        </m:sSubPr>
+                        <m:e>
+                          <m:r>
+                            <w:rPr>
+                              <w:rFonts w:ascii="Cambria Math" w:eastAsiaTheme="minorEastAsia" w:hAnsi="Cambria Math"/>
+                            </w:rPr>
+                            <m:t>e</m:t>
+                          </m:r>
+                        </m:e>
+                        <m:sub>
+                          <m:r>
+                            <w:rPr>
+                              <w:rFonts w:ascii="Cambria Math" w:eastAsiaTheme="minorEastAsia" w:hAnsi="Cambria Math"/>
+                            </w:rPr>
+                            <m:t>i,1</m:t>
+                          </m:r>
+                        </m:sub>
+                      </m:sSub>
+                      <m:r>
+                        <w:rPr>
+                          <w:rFonts w:ascii="Cambria Math" w:eastAsiaTheme="minorEastAsia" w:hAnsi="Cambria Math"/>
+                        </w:rPr>
+                        <m:t>-</m:t>
+                      </m:r>
+                      <m:sSub>
+                        <m:sSubPr>
+                          <m:ctrlPr>
+                            <w:rPr>
+                              <w:rFonts w:ascii="Cambria Math" w:eastAsiaTheme="minorEastAsia" w:hAnsi="Cambria Math"/>
+                              <w:i/>
+                            </w:rPr>
+                          </m:ctrlPr>
+                        </m:sSubPr>
+                        <m:e>
+                          <m:r>
+                            <w:rPr>
+                              <w:rFonts w:ascii="Cambria Math" w:eastAsiaTheme="minorEastAsia" w:hAnsi="Cambria Math"/>
+                            </w:rPr>
+                            <m:t>e</m:t>
+                          </m:r>
+                        </m:e>
+                        <m:sub>
+                          <m:r>
+                            <w:rPr>
+                              <w:rFonts w:ascii="Cambria Math" w:eastAsiaTheme="minorEastAsia" w:hAnsi="Cambria Math"/>
+                            </w:rPr>
+                            <m:t>i,0</m:t>
+                          </m:r>
+                        </m:sub>
+                      </m:sSub>
+                    </m:e>
+                  </m:d>
+                </m:e>
+              </m:d>
+              <m:ctrlPr>
+                <w:rPr>
+                  <w:rFonts w:ascii="Cambria Math" w:eastAsiaTheme="minorEastAsia" w:hAnsi="Cambria Math"/>
+                  <w:i/>
+                </w:rPr>
+              </m:ctrlPr>
+            </m:e>
+          </m:nary>
+        </m:oMath>
+      </m:oMathPara>
+    </w:p>
+    <w:p>
+      <w:pPr>
+        <w:jc w:val="both"/>
+        <w:rPr>
+          <w:rFonts w:eastAsiaTheme="minorEastAsia"/>
+        </w:rPr>
+      </w:pPr>
+      <w:r>
+        <w:rPr>
+          <w:rFonts w:eastAsiaTheme="minorEastAsia"/>
+        </w:rPr>
+        <w:t>Jeg udvider parenteserne og forsimpler:</w:t>
+      </w:r>
+    </w:p>
+    <w:p>
+      <w:pPr>
+        <w:jc w:val="both"/>
+        <w:rPr>
+          <w:rFonts w:eastAsiaTheme="minorEastAsia"/>
+        </w:rPr>
+      </w:pPr>
+      <m:oMathPara>
+        <m:oMath>
+          <m:r>
+            <w:rPr>
+              <w:rFonts w:ascii="Cambria Math" w:eastAsiaTheme="minorEastAsia" w:hAnsi="Cambria Math"/>
+            </w:rPr>
+            <m:t>C+I</m:t>
+          </m:r>
+          <m:r>
+            <m:rPr>
+              <m:aln/>
+            </m:rPr>
+            <w:rPr>
+              <w:rFonts w:ascii="Cambria Math" w:eastAsiaTheme="minorEastAsia" w:hAnsi="Cambria Math"/>
+            </w:rPr>
+            <m:t>=</m:t>
+          </m:r>
+          <m:f>
+            <m:fPr>
+              <m:ctrlPr>
+                <w:rPr>
+                  <w:rFonts w:ascii="Cambria Math" w:eastAsiaTheme="minorEastAsia" w:hAnsi="Cambria Math"/>
+                </w:rPr>
+              </m:ctrlPr>
+            </m:fPr>
+            <m:num>
+              <m:r>
+                <w:rPr>
+                  <w:rFonts w:ascii="Cambria Math" w:eastAsiaTheme="minorEastAsia" w:hAnsi="Cambria Math"/>
+                </w:rPr>
+                <m:t>1</m:t>
+              </m:r>
+              <m:ctrlPr>
+                <w:rPr>
+                  <w:rFonts w:ascii="Cambria Math" w:eastAsiaTheme="minorEastAsia" w:hAnsi="Cambria Math"/>
+                  <w:i/>
+                </w:rPr>
+              </m:ctrlPr>
+            </m:num>
+            <m:den>
+              <m:r>
+                <w:rPr>
+                  <w:rFonts w:ascii="Cambria Math" w:eastAsiaTheme="minorEastAsia" w:hAnsi="Cambria Math"/>
+                </w:rPr>
+                <m:t>2</m:t>
+              </m:r>
+              <m:ctrlPr>
+                <w:rPr>
+                  <w:rFonts w:ascii="Cambria Math" w:eastAsiaTheme="minorEastAsia" w:hAnsi="Cambria Math"/>
+                  <w:i/>
+                </w:rPr>
+              </m:ctrlPr>
+            </m:den>
+          </m:f>
+          <m:d>
+            <m:dPr>
+              <m:begChr m:val="["/>
+              <m:endChr m:val="]"/>
+              <m:ctrlPr>
+                <w:rPr>
+                  <w:rFonts w:ascii="Cambria Math" w:eastAsiaTheme="minorEastAsia" w:hAnsi="Cambria Math"/>
+                  <w:i/>
+                </w:rPr>
+              </m:ctrlPr>
+            </m:dPr>
+            <m:e>
+              <m:sSub>
+                <m:sSubPr>
+                  <m:ctrlPr>
+                    <w:rPr>
+                      <w:rFonts w:ascii="Cambria Math" w:eastAsiaTheme="minorEastAsia" w:hAnsi="Cambria Math"/>
+                      <w:i/>
+                    </w:rPr>
+                  </m:ctrlPr>
+                </m:sSubPr>
+                <m:e>
+                  <m:r>
+                    <w:rPr>
+                      <w:rFonts w:ascii="Cambria Math" w:eastAsiaTheme="minorEastAsia" w:hAnsi="Cambria Math"/>
+                    </w:rPr>
+                    <m:t>s</m:t>
+                  </m:r>
+                </m:e>
+                <m:sub>
+                  <m:r>
+                    <w:rPr>
+                      <w:rFonts w:ascii="Cambria Math" w:eastAsiaTheme="minorEastAsia" w:hAnsi="Cambria Math"/>
+                    </w:rPr>
+                    <m:t>i,1</m:t>
+                  </m:r>
+                </m:sub>
+              </m:sSub>
+              <m:sSub>
+                <m:sSubPr>
+                  <m:ctrlPr>
+                    <w:rPr>
+                      <w:rFonts w:ascii="Cambria Math" w:eastAsiaTheme="minorEastAsia" w:hAnsi="Cambria Math"/>
+                      <w:i/>
+                    </w:rPr>
+                  </m:ctrlPr>
+                </m:sSubPr>
+                <m:e>
+                  <m:r>
+                    <w:rPr>
+                      <w:rFonts w:ascii="Cambria Math" w:eastAsiaTheme="minorEastAsia" w:hAnsi="Cambria Math"/>
+                    </w:rPr>
+                    <m:t>e</m:t>
+                  </m:r>
+                </m:e>
+                <m:sub>
+                  <m:r>
+                    <w:rPr>
+                      <w:rFonts w:ascii="Cambria Math" w:eastAsiaTheme="minorEastAsia" w:hAnsi="Cambria Math"/>
+                    </w:rPr>
+                    <m:t>i,0</m:t>
+                  </m:r>
+                </m:sub>
+              </m:sSub>
+              <m:r>
+                <w:rPr>
+                  <w:rFonts w:ascii="Cambria Math" w:eastAsiaTheme="minorEastAsia" w:hAnsi="Cambria Math"/>
+                </w:rPr>
+                <m:t>+</m:t>
+              </m:r>
+              <m:sSub>
+                <m:sSubPr>
+                  <m:ctrlPr>
+                    <w:rPr>
+                      <w:rFonts w:ascii="Cambria Math" w:eastAsiaTheme="minorEastAsia" w:hAnsi="Cambria Math"/>
+                      <w:i/>
+                    </w:rPr>
+                  </m:ctrlPr>
+                </m:sSubPr>
+                <m:e>
+                  <m:r>
+                    <w:rPr>
+                      <w:rFonts w:ascii="Cambria Math" w:eastAsiaTheme="minorEastAsia" w:hAnsi="Cambria Math"/>
+                    </w:rPr>
+                    <m:t>s</m:t>
+                  </m:r>
+                </m:e>
+                <m:sub>
+                  <m:r>
+                    <w:rPr>
+                      <w:rFonts w:ascii="Cambria Math" w:eastAsiaTheme="minorEastAsia" w:hAnsi="Cambria Math"/>
+                    </w:rPr>
+                    <m:t>i,1</m:t>
+                  </m:r>
+                </m:sub>
+              </m:sSub>
+              <m:sSub>
+                <m:sSubPr>
+                  <m:ctrlPr>
+                    <w:rPr>
+                      <w:rFonts w:ascii="Cambria Math" w:eastAsiaTheme="minorEastAsia" w:hAnsi="Cambria Math"/>
+                      <w:i/>
+                    </w:rPr>
+                  </m:ctrlPr>
+                </m:sSubPr>
+                <m:e>
+                  <m:r>
+                    <w:rPr>
+                      <w:rFonts w:ascii="Cambria Math" w:eastAsiaTheme="minorEastAsia" w:hAnsi="Cambria Math"/>
+                    </w:rPr>
+                    <m:t>e</m:t>
+                  </m:r>
+                </m:e>
+                <m:sub>
+                  <m:r>
+                    <w:rPr>
+                      <w:rFonts w:ascii="Cambria Math" w:eastAsiaTheme="minorEastAsia" w:hAnsi="Cambria Math"/>
+                    </w:rPr>
+                    <m:t>i,1</m:t>
+                  </m:r>
+                </m:sub>
+              </m:sSub>
+              <m:r>
+                <w:rPr>
+                  <w:rFonts w:ascii="Cambria Math" w:eastAsiaTheme="minorEastAsia" w:hAnsi="Cambria Math"/>
+                </w:rPr>
+                <m:t>-</m:t>
+              </m:r>
+              <m:sSub>
+                <m:sSubPr>
+                  <m:ctrlPr>
+                    <w:rPr>
+                      <w:rFonts w:ascii="Cambria Math" w:eastAsiaTheme="minorEastAsia" w:hAnsi="Cambria Math"/>
+                      <w:i/>
+                    </w:rPr>
+                  </m:ctrlPr>
+                </m:sSubPr>
+                <m:e>
+                  <m:r>
+                    <w:rPr>
+                      <w:rFonts w:ascii="Cambria Math" w:eastAsiaTheme="minorEastAsia" w:hAnsi="Cambria Math"/>
+                    </w:rPr>
+                    <m:t>s</m:t>
+                  </m:r>
+                </m:e>
+                <m:sub>
+                  <m:r>
+                    <w:rPr>
+                      <w:rFonts w:ascii="Cambria Math" w:eastAsiaTheme="minorEastAsia" w:hAnsi="Cambria Math"/>
+                    </w:rPr>
+                    <m:t>i,0</m:t>
+                  </m:r>
+                </m:sub>
+              </m:sSub>
+              <m:sSub>
+                <m:sSubPr>
+                  <m:ctrlPr>
+                    <w:rPr>
+                      <w:rFonts w:ascii="Cambria Math" w:eastAsiaTheme="minorEastAsia" w:hAnsi="Cambria Math"/>
+                      <w:i/>
+                    </w:rPr>
+                  </m:ctrlPr>
+                </m:sSubPr>
+                <m:e>
+                  <m:r>
+                    <w:rPr>
+                      <w:rFonts w:ascii="Cambria Math" w:eastAsiaTheme="minorEastAsia" w:hAnsi="Cambria Math"/>
+                    </w:rPr>
+                    <m:t>e</m:t>
+                  </m:r>
+                </m:e>
+                <m:sub>
+                  <m:r>
+                    <w:rPr>
+                      <w:rFonts w:ascii="Cambria Math" w:eastAsiaTheme="minorEastAsia" w:hAnsi="Cambria Math"/>
+                    </w:rPr>
+                    <m:t>i,0</m:t>
+                  </m:r>
+                </m:sub>
+              </m:sSub>
+              <m:r>
+                <w:rPr>
+                  <w:rFonts w:ascii="Cambria Math" w:eastAsiaTheme="minorEastAsia" w:hAnsi="Cambria Math"/>
+                </w:rPr>
+                <m:t>-</m:t>
+              </m:r>
+              <m:sSub>
+                <m:sSubPr>
+                  <m:ctrlPr>
+                    <w:rPr>
+                      <w:rFonts w:ascii="Cambria Math" w:eastAsiaTheme="minorEastAsia" w:hAnsi="Cambria Math"/>
+                      <w:i/>
+                    </w:rPr>
+                  </m:ctrlPr>
+                </m:sSubPr>
+                <m:e>
+                  <m:r>
+                    <w:rPr>
+                      <w:rFonts w:ascii="Cambria Math" w:eastAsiaTheme="minorEastAsia" w:hAnsi="Cambria Math"/>
+                    </w:rPr>
+                    <m:t>s</m:t>
+                  </m:r>
+                </m:e>
+                <m:sub>
+                  <m:r>
+                    <w:rPr>
+                      <w:rFonts w:ascii="Cambria Math" w:eastAsiaTheme="minorEastAsia" w:hAnsi="Cambria Math"/>
+                    </w:rPr>
+                    <m:t>i,0</m:t>
+                  </m:r>
+                </m:sub>
+              </m:sSub>
+              <m:sSub>
+                <m:sSubPr>
+                  <m:ctrlPr>
+                    <w:rPr>
+                      <w:rFonts w:ascii="Cambria Math" w:eastAsiaTheme="minorEastAsia" w:hAnsi="Cambria Math"/>
+                      <w:i/>
+                    </w:rPr>
+                  </m:ctrlPr>
+                </m:sSubPr>
+                <m:e>
+                  <m:r>
+                    <w:rPr>
+                      <w:rFonts w:ascii="Cambria Math" w:eastAsiaTheme="minorEastAsia" w:hAnsi="Cambria Math"/>
+                    </w:rPr>
+                    <m:t>e</m:t>
+                  </m:r>
+                </m:e>
+                <m:sub>
+                  <m:r>
+                    <w:rPr>
+                      <w:rFonts w:ascii="Cambria Math" w:eastAsiaTheme="minorEastAsia" w:hAnsi="Cambria Math"/>
+                    </w:rPr>
+                    <m:t>i,1</m:t>
+                  </m:r>
+                </m:sub>
+              </m:sSub>
+              <m:r>
+                <w:rPr>
+                  <w:rFonts w:ascii="Cambria Math" w:eastAsiaTheme="minorEastAsia" w:hAnsi="Cambria Math"/>
+                </w:rPr>
+                <m:t>+</m:t>
+              </m:r>
+              <m:sSub>
+                <m:sSubPr>
+                  <m:ctrlPr>
+                    <w:rPr>
+                      <w:rFonts w:ascii="Cambria Math" w:eastAsiaTheme="minorEastAsia" w:hAnsi="Cambria Math"/>
+                      <w:i/>
+                    </w:rPr>
+                  </m:ctrlPr>
+                </m:sSubPr>
+                <m:e>
+                  <m:r>
+                    <w:rPr>
+                      <w:rFonts w:ascii="Cambria Math" w:eastAsiaTheme="minorEastAsia" w:hAnsi="Cambria Math"/>
+                    </w:rPr>
+                    <m:t>s</m:t>
+                  </m:r>
+                </m:e>
+                <m:sub>
+                  <m:r>
+                    <w:rPr>
+                      <w:rFonts w:ascii="Cambria Math" w:eastAsiaTheme="minorEastAsia" w:hAnsi="Cambria Math"/>
+                    </w:rPr>
+                    <m:t>i,0</m:t>
+                  </m:r>
+                </m:sub>
+              </m:sSub>
+              <m:sSub>
+                <m:sSubPr>
+                  <m:ctrlPr>
+                    <w:rPr>
+                      <w:rFonts w:ascii="Cambria Math" w:eastAsiaTheme="minorEastAsia" w:hAnsi="Cambria Math"/>
+                      <w:i/>
+                    </w:rPr>
+                  </m:ctrlPr>
+                </m:sSubPr>
+                <m:e>
+                  <m:r>
+                    <w:rPr>
+                      <w:rFonts w:ascii="Cambria Math" w:eastAsiaTheme="minorEastAsia" w:hAnsi="Cambria Math"/>
+                    </w:rPr>
+                    <m:t>e</m:t>
+                  </m:r>
+                </m:e>
+                <m:sub>
+                  <m:r>
+                    <w:rPr>
+                      <w:rFonts w:ascii="Cambria Math" w:eastAsiaTheme="minorEastAsia" w:hAnsi="Cambria Math"/>
+                    </w:rPr>
+                    <m:t>i,1</m:t>
+                  </m:r>
+                </m:sub>
+              </m:sSub>
+              <m:r>
+                <w:rPr>
+                  <w:rFonts w:ascii="Cambria Math" w:eastAsiaTheme="minorEastAsia" w:hAnsi="Cambria Math"/>
+                </w:rPr>
+                <m:t>-</m:t>
+              </m:r>
+              <m:sSub>
+                <m:sSubPr>
+                  <m:ctrlPr>
+                    <w:rPr>
+                      <w:rFonts w:ascii="Cambria Math" w:eastAsiaTheme="minorEastAsia" w:hAnsi="Cambria Math"/>
+                      <w:i/>
+                    </w:rPr>
+                  </m:ctrlPr>
+                </m:sSubPr>
+                <m:e>
+                  <m:r>
+                    <w:rPr>
+                      <w:rFonts w:ascii="Cambria Math" w:eastAsiaTheme="minorEastAsia" w:hAnsi="Cambria Math"/>
+                    </w:rPr>
+                    <m:t>s</m:t>
+                  </m:r>
+                </m:e>
+                <m:sub>
+                  <m:r>
+                    <w:rPr>
+                      <w:rFonts w:ascii="Cambria Math" w:eastAsiaTheme="minorEastAsia" w:hAnsi="Cambria Math"/>
+                    </w:rPr>
+                    <m:t>i,0</m:t>
+                  </m:r>
+                </m:sub>
+              </m:sSub>
+              <m:sSub>
+                <m:sSubPr>
+                  <m:ctrlPr>
+                    <w:rPr>
+                      <w:rFonts w:ascii="Cambria Math" w:eastAsiaTheme="minorEastAsia" w:hAnsi="Cambria Math"/>
+                      <w:i/>
+                    </w:rPr>
+                  </m:ctrlPr>
+                </m:sSubPr>
+                <m:e>
+                  <m:r>
+                    <w:rPr>
+                      <w:rFonts w:ascii="Cambria Math" w:eastAsiaTheme="minorEastAsia" w:hAnsi="Cambria Math"/>
+                    </w:rPr>
+                    <m:t>e</m:t>
+                  </m:r>
+                </m:e>
+                <m:sub>
+                  <m:r>
+                    <w:rPr>
+                      <w:rFonts w:ascii="Cambria Math" w:eastAsiaTheme="minorEastAsia" w:hAnsi="Cambria Math"/>
+                    </w:rPr>
+                    <m:t>i,0</m:t>
+                  </m:r>
+                </m:sub>
+              </m:sSub>
+              <m:r>
+                <w:rPr>
+                  <w:rFonts w:ascii="Cambria Math" w:eastAsiaTheme="minorEastAsia" w:hAnsi="Cambria Math"/>
+                </w:rPr>
+                <m:t>+</m:t>
+              </m:r>
+              <m:sSub>
+                <m:sSubPr>
+                  <m:ctrlPr>
+                    <w:rPr>
+                      <w:rFonts w:ascii="Cambria Math" w:eastAsiaTheme="minorEastAsia" w:hAnsi="Cambria Math"/>
+                      <w:i/>
+                    </w:rPr>
+                  </m:ctrlPr>
+                </m:sSubPr>
+                <m:e>
+                  <m:r>
+                    <w:rPr>
+                      <w:rFonts w:ascii="Cambria Math" w:eastAsiaTheme="minorEastAsia" w:hAnsi="Cambria Math"/>
+                    </w:rPr>
+                    <m:t>s</m:t>
+                  </m:r>
+                </m:e>
+                <m:sub>
+                  <m:r>
+                    <w:rPr>
+                      <w:rFonts w:ascii="Cambria Math" w:eastAsiaTheme="minorEastAsia" w:hAnsi="Cambria Math"/>
+                    </w:rPr>
+                    <m:t>i,1</m:t>
+                  </m:r>
+                </m:sub>
+              </m:sSub>
+              <m:sSub>
+                <m:sSubPr>
+                  <m:ctrlPr>
+                    <w:rPr>
+                      <w:rFonts w:ascii="Cambria Math" w:eastAsiaTheme="minorEastAsia" w:hAnsi="Cambria Math"/>
+                      <w:i/>
+                    </w:rPr>
+                  </m:ctrlPr>
+                </m:sSubPr>
+                <m:e>
+                  <m:r>
+                    <w:rPr>
+                      <w:rFonts w:ascii="Cambria Math" w:eastAsiaTheme="minorEastAsia" w:hAnsi="Cambria Math"/>
+                    </w:rPr>
+                    <m:t>e</m:t>
+                  </m:r>
+                </m:e>
+                <m:sub>
+                  <m:r>
+                    <w:rPr>
+                      <w:rFonts w:ascii="Cambria Math" w:eastAsiaTheme="minorEastAsia" w:hAnsi="Cambria Math"/>
+                    </w:rPr>
+                    <m:t>i,1</m:t>
+                  </m:r>
+                </m:sub>
+              </m:sSub>
+              <m:r>
+                <w:rPr>
+                  <w:rFonts w:ascii="Cambria Math" w:eastAsiaTheme="minorEastAsia" w:hAnsi="Cambria Math"/>
+                </w:rPr>
+                <m:t>-</m:t>
+              </m:r>
+              <m:sSub>
+                <m:sSubPr>
+                  <m:ctrlPr>
+                    <w:rPr>
+                      <w:rFonts w:ascii="Cambria Math" w:eastAsiaTheme="minorEastAsia" w:hAnsi="Cambria Math"/>
+                      <w:i/>
+                    </w:rPr>
+                  </m:ctrlPr>
+                </m:sSubPr>
+                <m:e>
+                  <m:r>
+                    <w:rPr>
+                      <w:rFonts w:ascii="Cambria Math" w:eastAsiaTheme="minorEastAsia" w:hAnsi="Cambria Math"/>
+                    </w:rPr>
+                    <m:t>s</m:t>
+                  </m:r>
+                </m:e>
+                <m:sub>
+                  <m:r>
+                    <w:rPr>
+                      <w:rFonts w:ascii="Cambria Math" w:eastAsiaTheme="minorEastAsia" w:hAnsi="Cambria Math"/>
+                    </w:rPr>
+                    <m:t>i,1</m:t>
+                  </m:r>
+                </m:sub>
+              </m:sSub>
+              <m:sSub>
+                <m:sSubPr>
+                  <m:ctrlPr>
+                    <w:rPr>
+                      <w:rFonts w:ascii="Cambria Math" w:eastAsiaTheme="minorEastAsia" w:hAnsi="Cambria Math"/>
+                      <w:i/>
+                    </w:rPr>
+                  </m:ctrlPr>
+                </m:sSubPr>
+                <m:e>
+                  <m:r>
+                    <w:rPr>
+                      <w:rFonts w:ascii="Cambria Math" w:eastAsiaTheme="minorEastAsia" w:hAnsi="Cambria Math"/>
+                    </w:rPr>
+                    <m:t>e</m:t>
+                  </m:r>
+                </m:e>
+                <m:sub>
+                  <m:r>
+                    <w:rPr>
+                      <w:rFonts w:ascii="Cambria Math" w:eastAsiaTheme="minorEastAsia" w:hAnsi="Cambria Math"/>
+                    </w:rPr>
+                    <m:t>i,0</m:t>
+                  </m:r>
+                </m:sub>
+              </m:sSub>
+            </m:e>
+          </m:d>
+          <m:r>
+            <w:rPr>
+              <w:rFonts w:eastAsiaTheme="minorEastAsia"/>
+            </w:rPr>
+            <w:br/>
+          </m:r>
+        </m:oMath>
+        <m:oMath>
+          <m:r>
+            <w:rPr>
+              <w:rFonts w:ascii="Cambria Math" w:eastAsiaTheme="minorEastAsia" w:hAnsi="Cambria Math"/>
+            </w:rPr>
+            <m:t>C+I</m:t>
+          </m:r>
+          <m:r>
+            <m:rPr>
+              <m:aln/>
+            </m:rPr>
+            <w:rPr>
+              <w:rFonts w:ascii="Cambria Math" w:eastAsiaTheme="minorEastAsia" w:hAnsi="Cambria Math"/>
+            </w:rPr>
+            <m:t>=</m:t>
+          </m:r>
+          <m:f>
+            <m:fPr>
+              <m:ctrlPr>
+                <w:rPr>
+                  <w:rFonts w:ascii="Cambria Math" w:eastAsiaTheme="minorEastAsia" w:hAnsi="Cambria Math"/>
+                </w:rPr>
+              </m:ctrlPr>
+            </m:fPr>
+            <m:num>
+              <m:r>
+                <w:rPr>
+                  <w:rFonts w:ascii="Cambria Math" w:eastAsiaTheme="minorEastAsia" w:hAnsi="Cambria Math"/>
+                </w:rPr>
+                <m:t>1</m:t>
+              </m:r>
+              <m:ctrlPr>
+                <w:rPr>
+                  <w:rFonts w:ascii="Cambria Math" w:eastAsiaTheme="minorEastAsia" w:hAnsi="Cambria Math"/>
+                  <w:i/>
+                </w:rPr>
+              </m:ctrlPr>
+            </m:num>
+            <m:den>
+              <m:r>
+                <w:rPr>
+                  <w:rFonts w:ascii="Cambria Math" w:eastAsiaTheme="minorEastAsia" w:hAnsi="Cambria Math"/>
+                </w:rPr>
+                <m:t>2</m:t>
+              </m:r>
+              <m:ctrlPr>
+                <w:rPr>
+                  <w:rFonts w:ascii="Cambria Math" w:eastAsiaTheme="minorEastAsia" w:hAnsi="Cambria Math"/>
+                  <w:i/>
+                </w:rPr>
+              </m:ctrlPr>
+            </m:den>
+          </m:f>
+          <m:d>
+            <m:dPr>
+              <m:begChr m:val="["/>
+              <m:endChr m:val="]"/>
+              <m:ctrlPr>
+                <w:rPr>
+                  <w:rFonts w:ascii="Cambria Math" w:eastAsiaTheme="minorEastAsia" w:hAnsi="Cambria Math"/>
+                  <w:i/>
+                </w:rPr>
+              </m:ctrlPr>
+            </m:dPr>
+            <m:e>
+              <m:sSub>
+                <m:sSubPr>
+                  <m:ctrlPr>
+                    <w:rPr>
+                      <w:rFonts w:ascii="Cambria Math" w:eastAsiaTheme="minorEastAsia" w:hAnsi="Cambria Math"/>
+                      <w:i/>
+                    </w:rPr>
+                  </m:ctrlPr>
+                </m:sSubPr>
+                <m:e>
+                  <m:r>
+                    <w:rPr>
+                      <w:rFonts w:ascii="Cambria Math" w:eastAsiaTheme="minorEastAsia" w:hAnsi="Cambria Math"/>
+                    </w:rPr>
+                    <m:t>s</m:t>
+                  </m:r>
+                </m:e>
+                <m:sub>
+                  <m:r>
+                    <w:rPr>
+                      <w:rFonts w:ascii="Cambria Math" w:eastAsiaTheme="minorEastAsia" w:hAnsi="Cambria Math"/>
+                    </w:rPr>
+                    <m:t>i,1</m:t>
+                  </m:r>
+                </m:sub>
+              </m:sSub>
+              <m:sSub>
+                <m:sSubPr>
+                  <m:ctrlPr>
+                    <w:rPr>
+                      <w:rFonts w:ascii="Cambria Math" w:eastAsiaTheme="minorEastAsia" w:hAnsi="Cambria Math"/>
+                      <w:i/>
+                    </w:rPr>
+                  </m:ctrlPr>
+                </m:sSubPr>
+                <m:e>
+                  <m:r>
+                    <w:rPr>
+                      <w:rFonts w:ascii="Cambria Math" w:eastAsiaTheme="minorEastAsia" w:hAnsi="Cambria Math"/>
+                    </w:rPr>
+                    <m:t>e</m:t>
+                  </m:r>
+                </m:e>
+                <m:sub>
+                  <m:r>
+                    <w:rPr>
+                      <w:rFonts w:ascii="Cambria Math" w:eastAsiaTheme="minorEastAsia" w:hAnsi="Cambria Math"/>
+                    </w:rPr>
+                    <m:t>i,1</m:t>
+                  </m:r>
+                </m:sub>
+              </m:sSub>
+              <m:r>
+                <w:rPr>
+                  <w:rFonts w:ascii="Cambria Math" w:eastAsiaTheme="minorEastAsia" w:hAnsi="Cambria Math"/>
+                </w:rPr>
+                <m:t>-</m:t>
+              </m:r>
+              <m:sSub>
+                <m:sSubPr>
+                  <m:ctrlPr>
+                    <w:rPr>
+                      <w:rFonts w:ascii="Cambria Math" w:eastAsiaTheme="minorEastAsia" w:hAnsi="Cambria Math"/>
+                      <w:i/>
+                    </w:rPr>
+                  </m:ctrlPr>
+                </m:sSubPr>
+                <m:e>
+                  <m:r>
+                    <w:rPr>
+                      <w:rFonts w:ascii="Cambria Math" w:eastAsiaTheme="minorEastAsia" w:hAnsi="Cambria Math"/>
+                    </w:rPr>
+                    <m:t>s</m:t>
+                  </m:r>
+                </m:e>
+                <m:sub>
+                  <m:r>
+                    <w:rPr>
+                      <w:rFonts w:ascii="Cambria Math" w:eastAsiaTheme="minorEastAsia" w:hAnsi="Cambria Math"/>
+                    </w:rPr>
+                    <m:t>i,0</m:t>
+                  </m:r>
+                </m:sub>
+              </m:sSub>
+              <m:sSub>
+                <m:sSubPr>
+                  <m:ctrlPr>
+                    <w:rPr>
+                      <w:rFonts w:ascii="Cambria Math" w:eastAsiaTheme="minorEastAsia" w:hAnsi="Cambria Math"/>
+                      <w:i/>
+                    </w:rPr>
+                  </m:ctrlPr>
+                </m:sSubPr>
+                <m:e>
+                  <m:r>
+                    <w:rPr>
+                      <w:rFonts w:ascii="Cambria Math" w:eastAsiaTheme="minorEastAsia" w:hAnsi="Cambria Math"/>
+                    </w:rPr>
+                    <m:t>e</m:t>
+                  </m:r>
+                </m:e>
+                <m:sub>
+                  <m:r>
+                    <w:rPr>
+                      <w:rFonts w:ascii="Cambria Math" w:eastAsiaTheme="minorEastAsia" w:hAnsi="Cambria Math"/>
+                    </w:rPr>
+                    <m:t>i,0</m:t>
+                  </m:r>
+                </m:sub>
+              </m:sSub>
+              <m:r>
+                <w:rPr>
+                  <w:rFonts w:ascii="Cambria Math" w:eastAsiaTheme="minorEastAsia" w:hAnsi="Cambria Math"/>
+                </w:rPr>
+                <m:t>-</m:t>
+              </m:r>
+              <m:sSub>
+                <m:sSubPr>
+                  <m:ctrlPr>
+                    <w:rPr>
+                      <w:rFonts w:ascii="Cambria Math" w:eastAsiaTheme="minorEastAsia" w:hAnsi="Cambria Math"/>
+                      <w:i/>
+                    </w:rPr>
+                  </m:ctrlPr>
+                </m:sSubPr>
+                <m:e>
+                  <m:r>
+                    <w:rPr>
+                      <w:rFonts w:ascii="Cambria Math" w:eastAsiaTheme="minorEastAsia" w:hAnsi="Cambria Math"/>
+                    </w:rPr>
+                    <m:t>s</m:t>
+                  </m:r>
+                </m:e>
+                <m:sub>
+                  <m:r>
+                    <w:rPr>
+                      <w:rFonts w:ascii="Cambria Math" w:eastAsiaTheme="minorEastAsia" w:hAnsi="Cambria Math"/>
+                    </w:rPr>
+                    <m:t>i,0</m:t>
+                  </m:r>
+                </m:sub>
+              </m:sSub>
+              <m:sSub>
+                <m:sSubPr>
+                  <m:ctrlPr>
+                    <w:rPr>
+                      <w:rFonts w:ascii="Cambria Math" w:eastAsiaTheme="minorEastAsia" w:hAnsi="Cambria Math"/>
+                      <w:i/>
+                    </w:rPr>
+                  </m:ctrlPr>
+                </m:sSubPr>
+                <m:e>
+                  <m:r>
+                    <w:rPr>
+                      <w:rFonts w:ascii="Cambria Math" w:eastAsiaTheme="minorEastAsia" w:hAnsi="Cambria Math"/>
+                    </w:rPr>
+                    <m:t>e</m:t>
+                  </m:r>
+                </m:e>
+                <m:sub>
+                  <m:r>
+                    <w:rPr>
+                      <w:rFonts w:ascii="Cambria Math" w:eastAsiaTheme="minorEastAsia" w:hAnsi="Cambria Math"/>
+                    </w:rPr>
+                    <m:t>i,0</m:t>
+                  </m:r>
+                </m:sub>
+              </m:sSub>
+              <m:r>
+                <w:rPr>
+                  <w:rFonts w:ascii="Cambria Math" w:eastAsiaTheme="minorEastAsia" w:hAnsi="Cambria Math"/>
+                </w:rPr>
+                <m:t>+</m:t>
+              </m:r>
+              <m:sSub>
+                <m:sSubPr>
+                  <m:ctrlPr>
+                    <w:rPr>
+                      <w:rFonts w:ascii="Cambria Math" w:eastAsiaTheme="minorEastAsia" w:hAnsi="Cambria Math"/>
+                      <w:i/>
+                    </w:rPr>
+                  </m:ctrlPr>
+                </m:sSubPr>
+                <m:e>
+                  <m:r>
+                    <w:rPr>
+                      <w:rFonts w:ascii="Cambria Math" w:eastAsiaTheme="minorEastAsia" w:hAnsi="Cambria Math"/>
+                    </w:rPr>
+                    <m:t>s</m:t>
+                  </m:r>
+                </m:e>
+                <m:sub>
+                  <m:r>
+                    <w:rPr>
+                      <w:rFonts w:ascii="Cambria Math" w:eastAsiaTheme="minorEastAsia" w:hAnsi="Cambria Math"/>
+                    </w:rPr>
+                    <m:t>i,1</m:t>
+                  </m:r>
+                </m:sub>
+              </m:sSub>
+              <m:sSub>
+                <m:sSubPr>
+                  <m:ctrlPr>
+                    <w:rPr>
+                      <w:rFonts w:ascii="Cambria Math" w:eastAsiaTheme="minorEastAsia" w:hAnsi="Cambria Math"/>
+                      <w:i/>
+                    </w:rPr>
+                  </m:ctrlPr>
+                </m:sSubPr>
+                <m:e>
+                  <m:r>
+                    <w:rPr>
+                      <w:rFonts w:ascii="Cambria Math" w:eastAsiaTheme="minorEastAsia" w:hAnsi="Cambria Math"/>
+                    </w:rPr>
+                    <m:t>e</m:t>
+                  </m:r>
+                </m:e>
+                <m:sub>
+                  <m:r>
+                    <w:rPr>
+                      <w:rFonts w:ascii="Cambria Math" w:eastAsiaTheme="minorEastAsia" w:hAnsi="Cambria Math"/>
+                    </w:rPr>
+                    <m:t>i,1</m:t>
+                  </m:r>
+                </m:sub>
+              </m:sSub>
+            </m:e>
+          </m:d>
+          <m:r>
+            <w:rPr>
+              <w:rFonts w:eastAsiaTheme="minorEastAsia"/>
+            </w:rPr>
+            <w:br/>
+          </m:r>
+        </m:oMath>
+        <m:oMath>
+          <m:r>
+            <w:rPr>
+              <w:rFonts w:ascii="Cambria Math" w:eastAsiaTheme="minorEastAsia" w:hAnsi="Cambria Math"/>
+            </w:rPr>
+            <m:t>C+I</m:t>
+          </m:r>
+          <m:r>
+            <m:rPr>
+              <m:aln/>
+            </m:rPr>
+            <w:rPr>
+              <w:rFonts w:ascii="Cambria Math" w:eastAsiaTheme="minorEastAsia" w:hAnsi="Cambria Math"/>
+            </w:rPr>
+            <m:t>=</m:t>
+          </m:r>
+          <m:sSub>
+            <m:sSubPr>
+              <m:ctrlPr>
+                <w:rPr>
+                  <w:rFonts w:ascii="Cambria Math" w:eastAsiaTheme="minorEastAsia" w:hAnsi="Cambria Math"/>
+                  <w:i/>
+                </w:rPr>
+              </m:ctrlPr>
+            </m:sSubPr>
+            <m:e>
+              <m:r>
+                <w:rPr>
+                  <w:rFonts w:ascii="Cambria Math" w:eastAsiaTheme="minorEastAsia" w:hAnsi="Cambria Math"/>
+                </w:rPr>
+                <m:t>s</m:t>
+              </m:r>
+            </m:e>
+            <m:sub>
+              <m:r>
+                <w:rPr>
+                  <w:rFonts w:ascii="Cambria Math" w:eastAsiaTheme="minorEastAsia" w:hAnsi="Cambria Math"/>
+                </w:rPr>
+                <m:t>i,1</m:t>
+              </m:r>
+            </m:sub>
+          </m:sSub>
+          <m:sSub>
+            <m:sSubPr>
+              <m:ctrlPr>
+                <w:rPr>
+                  <w:rFonts w:ascii="Cambria Math" w:eastAsiaTheme="minorEastAsia" w:hAnsi="Cambria Math"/>
+                  <w:i/>
+                </w:rPr>
+              </m:ctrlPr>
+            </m:sSubPr>
+            <m:e>
+              <m:r>
+                <w:rPr>
+                  <w:rFonts w:ascii="Cambria Math" w:eastAsiaTheme="minorEastAsia" w:hAnsi="Cambria Math"/>
+                </w:rPr>
+                <m:t>e</m:t>
+              </m:r>
+            </m:e>
+            <m:sub>
+              <m:r>
+                <w:rPr>
+                  <w:rFonts w:ascii="Cambria Math" w:eastAsiaTheme="minorEastAsia" w:hAnsi="Cambria Math"/>
+                </w:rPr>
+                <m:t>i,1</m:t>
+              </m:r>
+            </m:sub>
+          </m:sSub>
+          <m:r>
+            <w:rPr>
+              <w:rFonts w:ascii="Cambria Math" w:eastAsiaTheme="minorEastAsia" w:hAnsi="Cambria Math"/>
+            </w:rPr>
+            <m:t>-</m:t>
+          </m:r>
+          <m:sSub>
+            <m:sSubPr>
+              <m:ctrlPr>
+                <w:rPr>
+                  <w:rFonts w:ascii="Cambria Math" w:eastAsiaTheme="minorEastAsia" w:hAnsi="Cambria Math"/>
+                  <w:i/>
+                </w:rPr>
+              </m:ctrlPr>
+            </m:sSubPr>
+            <m:e>
+              <m:r>
+                <w:rPr>
+                  <w:rFonts w:ascii="Cambria Math" w:eastAsiaTheme="minorEastAsia" w:hAnsi="Cambria Math"/>
+                </w:rPr>
+                <m:t>s</m:t>
+              </m:r>
+            </m:e>
+            <m:sub>
+              <m:r>
+                <w:rPr>
+                  <w:rFonts w:ascii="Cambria Math" w:eastAsiaTheme="minorEastAsia" w:hAnsi="Cambria Math"/>
+                </w:rPr>
+                <m:t>i,0</m:t>
+              </m:r>
+            </m:sub>
+          </m:sSub>
+          <m:sSub>
+            <m:sSubPr>
+              <m:ctrlPr>
+                <w:rPr>
+                  <w:rFonts w:ascii="Cambria Math" w:eastAsiaTheme="minorEastAsia" w:hAnsi="Cambria Math"/>
+                  <w:i/>
+                </w:rPr>
+              </m:ctrlPr>
+            </m:sSubPr>
+            <m:e>
+              <m:r>
+                <w:rPr>
+                  <w:rFonts w:ascii="Cambria Math" w:eastAsiaTheme="minorEastAsia" w:hAnsi="Cambria Math"/>
+                </w:rPr>
+                <m:t>e</m:t>
+              </m:r>
+            </m:e>
+            <m:sub>
+              <m:r>
+                <w:rPr>
+                  <w:rFonts w:ascii="Cambria Math" w:eastAsiaTheme="minorEastAsia" w:hAnsi="Cambria Math"/>
+                </w:rPr>
+                <m:t>i,0</m:t>
+              </m:r>
+            </m:sub>
+          </m:sSub>
+        </m:oMath>
+      </m:oMathPara>
+    </w:p>
+    <w:p>
+      <w:pPr>
+        <w:jc w:val="both"/>
+        <w:rPr>
+          <w:rFonts w:eastAsiaTheme="minorEastAsia"/>
+        </w:rPr>
+      </w:pPr>
+      <w:r>
+        <w:rPr>
+          <w:rFonts w:eastAsiaTheme="minorEastAsia"/>
+        </w:rPr>
+        <w:t xml:space="preserve">Indsæt definitionen for </w:t>
+      </w:r>
+      <w:r>
+        <w:rPr>
+          <w:rFonts w:eastAsiaTheme="minorEastAsia"/>
+        </w:rPr>
+        <w:t>e</w:t>
+      </w:r>
+      <w:r>
+        <w:rPr>
+          <w:rFonts w:eastAsiaTheme="minorEastAsia"/>
+        </w:rPr>
+        <w:t>lektrificeringsraten</w:t>
+      </w:r>
+      <w:r>
+        <w:rPr>
+          <w:rFonts w:eastAsiaTheme="minorEastAsia"/>
+        </w:rPr>
+        <w:t xml:space="preserve">, </w:t>
+      </w:r>
+      <m:oMath>
+        <m:sSub>
+          <m:sSubPr>
+            <m:ctrlPr>
+              <w:rPr>
+                <w:rFonts w:ascii="Cambria Math" w:eastAsiaTheme="minorEastAsia" w:hAnsi="Cambria Math"/>
+                <w:i/>
+              </w:rPr>
+            </m:ctrlPr>
+          </m:sSubPr>
+          <m:e>
+            <m:r>
+              <w:rPr>
+                <w:rFonts w:ascii="Cambria Math" w:eastAsiaTheme="minorEastAsia" w:hAnsi="Cambria Math"/>
+              </w:rPr>
+              <m:t>E</m:t>
+            </m:r>
+          </m:e>
+          <m:sub>
+            <m:r>
+              <w:rPr>
+                <w:rFonts w:ascii="Cambria Math" w:eastAsiaTheme="minorEastAsia" w:hAnsi="Cambria Math"/>
+              </w:rPr>
+              <m:t>t</m:t>
+            </m:r>
+          </m:sub>
+        </m:sSub>
+      </m:oMath>
+      <w:r>
+        <w:rPr>
+          <w:rFonts w:eastAsiaTheme="minorEastAsia"/>
+        </w:rPr>
+        <w:t>:</w:t>
+      </w:r>
+    </w:p>
+    <w:p>
+      <w:pPr>
+        <w:jc w:val="both"/>
+        <w:rPr>
+          <w:rFonts w:eastAsiaTheme="minorEastAsia"/>
+        </w:rPr>
+      </w:pPr>
+      <m:oMathPara>
+        <m:oMath>
+          <m:r>
+            <w:rPr>
+              <w:rFonts w:ascii="Cambria Math" w:eastAsiaTheme="minorEastAsia" w:hAnsi="Cambria Math"/>
+            </w:rPr>
+            <m:t>C+I=</m:t>
+          </m:r>
+          <m:sSub>
+            <m:sSubPr>
+              <m:ctrlPr>
+                <w:rPr>
+                  <w:rFonts w:ascii="Cambria Math" w:eastAsiaTheme="minorEastAsia" w:hAnsi="Cambria Math"/>
+                  <w:i/>
+                </w:rPr>
+              </m:ctrlPr>
+            </m:sSubPr>
+            <m:e>
+              <m:r>
+                <w:rPr>
+                  <w:rFonts w:ascii="Cambria Math" w:eastAsiaTheme="minorEastAsia" w:hAnsi="Cambria Math"/>
+                </w:rPr>
+                <m:t>E</m:t>
+              </m:r>
+            </m:e>
+            <m:sub>
+              <m:r>
+                <w:rPr>
+                  <w:rFonts w:ascii="Cambria Math" w:eastAsiaTheme="minorEastAsia" w:hAnsi="Cambria Math"/>
+                </w:rPr>
+                <m:t>1</m:t>
+              </m:r>
+            </m:sub>
+          </m:sSub>
+          <m:r>
+            <w:rPr>
+              <w:rFonts w:ascii="Cambria Math" w:eastAsiaTheme="minorEastAsia" w:hAnsi="Cambria Math"/>
+            </w:rPr>
+            <m:t>-</m:t>
+          </m:r>
+          <m:sSub>
+            <m:sSubPr>
+              <m:ctrlPr>
+                <w:rPr>
+                  <w:rFonts w:ascii="Cambria Math" w:eastAsiaTheme="minorEastAsia" w:hAnsi="Cambria Math"/>
+                  <w:i/>
+                </w:rPr>
+              </m:ctrlPr>
+            </m:sSubPr>
+            <m:e>
+              <m:r>
+                <w:rPr>
+                  <w:rFonts w:ascii="Cambria Math" w:eastAsiaTheme="minorEastAsia" w:hAnsi="Cambria Math"/>
+                </w:rPr>
+                <m:t>E</m:t>
+              </m:r>
+            </m:e>
+            <m:sub>
+              <m:r>
+                <w:rPr>
+                  <w:rFonts w:ascii="Cambria Math" w:eastAsiaTheme="minorEastAsia" w:hAnsi="Cambria Math"/>
+                </w:rPr>
+                <m:t>0</m:t>
+              </m:r>
+            </m:sub>
+          </m:sSub>
+          <m:r>
+            <w:rPr>
+              <w:rFonts w:ascii="Cambria Math" w:eastAsiaTheme="minorEastAsia" w:hAnsi="Cambria Math"/>
+            </w:rPr>
+            <m:t>=</m:t>
+          </m:r>
+          <m:r>
+            <m:rPr>
+              <m:sty m:val="p"/>
+            </m:rPr>
+            <w:rPr>
+              <w:rFonts w:ascii="Cambria Math" w:eastAsiaTheme="minorEastAsia" w:hAnsi="Cambria Math"/>
+            </w:rPr>
+            <m:t>Δ</m:t>
+          </m:r>
+          <m:r>
+            <w:rPr>
+              <w:rFonts w:ascii="Cambria Math" w:eastAsiaTheme="minorEastAsia" w:hAnsi="Cambria Math"/>
+            </w:rPr>
+            <m:t>E.</m:t>
+          </m:r>
+          <m:r>
+            <m:rPr>
+              <m:sty m:val="p"/>
+            </m:rPr>
+            <w:rPr>
+              <w:rFonts w:ascii="Cambria Math" w:eastAsiaTheme="minorEastAsia" w:hAnsi="Cambria Math"/>
+            </w:rPr>
+            <m:t xml:space="preserve"> </m:t>
+          </m:r>
+          <m:r>
+            <m:rPr>
+              <m:sty m:val="p"/>
+            </m:rPr>
+            <w:rPr>
+              <w:rFonts w:ascii="Cambria Math" w:eastAsiaTheme="minorEastAsia" w:hAnsi="Cambria Math"/>
+            </w:rPr>
+            <m:t>  ∎</m:t>
+          </m:r>
+        </m:oMath>
+      </m:oMathPara>
+    </w:p>
+    <w:p>
+      <w:pPr>
+        <w:jc w:val="both"/>
+        <w:rPr>
+          <w:rFonts w:eastAsiaTheme="minorEastAsia"/>
+        </w:rPr>
+      </w:pPr>
+    </w:p>
+    <w:p>
+      <w:pPr>
+        <w:jc w:val="both"/>
+        <w:rPr>
+          <w:rFonts w:eastAsiaTheme="minorEastAsia"/>
+        </w:rPr>
+      </w:pPr>
     </w:p>
     <w:sectPr>
       <w:pgSz w:w="11906" w:h="16838"/>

</xml_diff>